<commit_message>
Arkusze wyrownawcze: na koncu liczenie plusow i zamalowanie zadania, wieksze kratki
Zamiast 'Popraw jedno zadanie' i 'Na koniec' jest ramka 'Po wspolnym
sprawdzeniu' (plusy pod numerami zadan, progi +/++/+++, kolka 1-12).
Wieksze pola wyboru i odstep po zadaniu z lista.

Co-Authored-By: Claude Opus 5.5 <noreply@anthropic.com>
</commit_message>
<xml_diff>
--- a/public/materialy/wyrownawcze/arkusz-1-kiermasz-dobrych-pomyslow.docx
+++ b/public/materialy/wyrownawcze/arkusz-1-kiermasz-dobrych-pomyslow.docx
@@ -376,7 +376,7 @@
     <w:p>
       <w:pPr>
         <w:keepNext w:val="0"/>
-        <w:spacing w:before="0" w:after="20" w:line="240" w:lineRule="auto"/>
+        <w:spacing w:before="0" w:after="30" w:line="240" w:lineRule="auto"/>
         <w:ind w:left="312"/>
       </w:pPr>
       <w:r>
@@ -385,15 +385,25 @@
           <w:b w:val="0"/>
           <w:i w:val="0"/>
           <w:color w:val="1F2937"/>
+          <w:sz w:val="26"/>
+        </w:rPr>
+        <w:t xml:space="preserve">☐ </w:t>
+      </w:r>
+      <w:r>
+        <w:rPr>
+          <w:rFonts w:ascii="Aptos" w:hAnsi="Aptos" w:eastAsia="Aptos"/>
+          <w:b w:val="0"/>
+          <w:i w:val="0"/>
+          <w:color w:val="1F2937"/>
           <w:sz w:val="20"/>
         </w:rPr>
-        <w:t>□ Lena</w:t>
+        <w:t>Lena</w:t>
       </w:r>
     </w:p>
     <w:p>
       <w:pPr>
         <w:keepNext w:val="0"/>
-        <w:spacing w:before="0" w:after="20" w:line="240" w:lineRule="auto"/>
+        <w:spacing w:before="0" w:after="30" w:line="240" w:lineRule="auto"/>
         <w:ind w:left="312"/>
       </w:pPr>
       <w:r>
@@ -402,15 +412,25 @@
           <w:b w:val="0"/>
           <w:i w:val="0"/>
           <w:color w:val="1F2937"/>
+          <w:sz w:val="26"/>
+        </w:rPr>
+        <w:t xml:space="preserve">☐ </w:t>
+      </w:r>
+      <w:r>
+        <w:rPr>
+          <w:rFonts w:ascii="Aptos" w:hAnsi="Aptos" w:eastAsia="Aptos"/>
+          <w:b w:val="0"/>
+          <w:i w:val="0"/>
+          <w:color w:val="1F2937"/>
           <w:sz w:val="20"/>
         </w:rPr>
-        <w:t>□ Olek</w:t>
+        <w:t>Olek</w:t>
       </w:r>
     </w:p>
     <w:p>
       <w:pPr>
         <w:keepNext w:val="0"/>
-        <w:spacing w:before="0" w:after="20" w:line="240" w:lineRule="auto"/>
+        <w:spacing w:before="0" w:after="140" w:line="240" w:lineRule="auto"/>
         <w:ind w:left="312"/>
       </w:pPr>
       <w:r>
@@ -419,9 +439,19 @@
           <w:b w:val="0"/>
           <w:i w:val="0"/>
           <w:color w:val="1F2937"/>
+          <w:sz w:val="26"/>
+        </w:rPr>
+        <w:t xml:space="preserve">☐ </w:t>
+      </w:r>
+      <w:r>
+        <w:rPr>
+          <w:rFonts w:ascii="Aptos" w:hAnsi="Aptos" w:eastAsia="Aptos"/>
+          <w:b w:val="0"/>
+          <w:i w:val="0"/>
+          <w:color w:val="1F2937"/>
           <w:sz w:val="20"/>
         </w:rPr>
-        <w:t>□ Sara</w:t>
+        <w:t>Sara</w:t>
       </w:r>
     </w:p>
     <w:p>
@@ -539,7 +569,7 @@
     <w:p>
       <w:pPr>
         <w:keepNext w:val="0"/>
-        <w:spacing w:before="0" w:after="20" w:line="240" w:lineRule="auto"/>
+        <w:spacing w:before="0" w:after="30" w:line="240" w:lineRule="auto"/>
         <w:ind w:left="312"/>
       </w:pPr>
       <w:r>
@@ -548,15 +578,25 @@
           <w:b w:val="0"/>
           <w:i w:val="0"/>
           <w:color w:val="1F2937"/>
+          <w:sz w:val="26"/>
+        </w:rPr>
+        <w:t xml:space="preserve">☐ </w:t>
+      </w:r>
+      <w:r>
+        <w:rPr>
+          <w:rFonts w:ascii="Aptos" w:hAnsi="Aptos" w:eastAsia="Aptos"/>
+          <w:b w:val="0"/>
+          <w:i w:val="0"/>
+          <w:color w:val="1F2937"/>
           <w:sz w:val="20"/>
         </w:rPr>
-        <w:t>□ Warto działać wspólnie, gdy pojawia się problem.</w:t>
+        <w:t>Warto działać wspólnie, gdy pojawia się problem.</w:t>
       </w:r>
     </w:p>
     <w:p>
       <w:pPr>
         <w:keepNext w:val="0"/>
-        <w:spacing w:before="0" w:after="20" w:line="240" w:lineRule="auto"/>
+        <w:spacing w:before="0" w:after="30" w:line="240" w:lineRule="auto"/>
         <w:ind w:left="312"/>
       </w:pPr>
       <w:r>
@@ -565,15 +605,25 @@
           <w:b w:val="0"/>
           <w:i w:val="0"/>
           <w:color w:val="1F2937"/>
+          <w:sz w:val="26"/>
+        </w:rPr>
+        <w:t xml:space="preserve">☐ </w:t>
+      </w:r>
+      <w:r>
+        <w:rPr>
+          <w:rFonts w:ascii="Aptos" w:hAnsi="Aptos" w:eastAsia="Aptos"/>
+          <w:b w:val="0"/>
+          <w:i w:val="0"/>
+          <w:color w:val="1F2937"/>
           <w:sz w:val="20"/>
         </w:rPr>
-        <w:t>□ Na kiermaszu należy sprzedawać tylko książki.</w:t>
+        <w:t>Na kiermaszu należy sprzedawać tylko książki.</w:t>
       </w:r>
     </w:p>
     <w:p>
       <w:pPr>
         <w:keepNext w:val="0"/>
-        <w:spacing w:before="0" w:after="20" w:line="240" w:lineRule="auto"/>
+        <w:spacing w:before="0" w:after="140" w:line="240" w:lineRule="auto"/>
         <w:ind w:left="312"/>
       </w:pPr>
       <w:r>
@@ -582,9 +632,19 @@
           <w:b w:val="0"/>
           <w:i w:val="0"/>
           <w:color w:val="1F2937"/>
+          <w:sz w:val="26"/>
+        </w:rPr>
+        <w:t xml:space="preserve">☐ </w:t>
+      </w:r>
+      <w:r>
+        <w:rPr>
+          <w:rFonts w:ascii="Aptos" w:hAnsi="Aptos" w:eastAsia="Aptos"/>
+          <w:b w:val="0"/>
+          <w:i w:val="0"/>
+          <w:color w:val="1F2937"/>
           <w:sz w:val="20"/>
         </w:rPr>
-        <w:t>□ Najlepiej pracuje się bez planu.</w:t>
+        <w:t>Najlepiej pracuje się bez planu.</w:t>
       </w:r>
     </w:p>
     <w:p>
@@ -1028,174 +1088,1717 @@
         <w:t>................................................................................................................................</w:t>
       </w:r>
     </w:p>
-    <w:p>
-      <w:pPr>
-        <w:pStyle w:val="Heading2"/>
-      </w:pPr>
-      <w:r>
-        <w:rPr>
-          <w:rFonts w:ascii="Aptos" w:hAnsi="Aptos" w:eastAsia="Aptos"/>
-          <w:b/>
-          <w:i w:val="0"/>
-          <w:color w:val="000000"/>
-          <w:sz w:val="23"/>
-        </w:rPr>
-        <w:t>Popraw jedno zadanie</w:t>
-      </w:r>
-    </w:p>
-    <w:p>
-      <w:pPr>
-        <w:keepNext w:val="0"/>
-        <w:spacing w:before="0" w:after="40" w:line="252" w:lineRule="auto"/>
-      </w:pPr>
-      <w:r>
-        <w:rPr>
-          <w:rFonts w:ascii="Aptos" w:hAnsi="Aptos" w:eastAsia="Aptos"/>
-          <w:b w:val="0"/>
-          <w:i w:val="0"/>
-          <w:color w:val="1F2937"/>
-          <w:sz w:val="19"/>
-        </w:rPr>
-        <w:t>Po wspólnym sprawdzeniu wybierz jedno zadanie, w którym był błąd. Zapisz poprawną odpowiedź i krótkie wyjaśnienie.</w:t>
-      </w:r>
-    </w:p>
-    <w:p>
-      <w:pPr>
-        <w:keepNext w:val="0"/>
-        <w:spacing w:before="0" w:after="40" w:line="252" w:lineRule="auto"/>
-      </w:pPr>
-      <w:r>
-        <w:rPr>
-          <w:rFonts w:ascii="Aptos" w:hAnsi="Aptos" w:eastAsia="Aptos"/>
-          <w:b w:val="0"/>
-          <w:i w:val="0"/>
-          <w:color w:val="9CA3AF"/>
-          <w:sz w:val="18"/>
-        </w:rPr>
-        <w:t>................................................................................................................................</w:t>
-      </w:r>
-    </w:p>
-    <w:p>
-      <w:pPr>
-        <w:keepNext w:val="0"/>
-        <w:spacing w:before="0" w:after="40" w:line="252" w:lineRule="auto"/>
-      </w:pPr>
-      <w:r>
-        <w:rPr>
-          <w:rFonts w:ascii="Aptos" w:hAnsi="Aptos" w:eastAsia="Aptos"/>
-          <w:b w:val="0"/>
-          <w:i w:val="0"/>
-          <w:color w:val="9CA3AF"/>
-          <w:sz w:val="18"/>
-        </w:rPr>
-        <w:t>................................................................................................................................</w:t>
-      </w:r>
-    </w:p>
-    <w:p>
-      <w:pPr>
-        <w:keepNext w:val="0"/>
-        <w:spacing w:before="0" w:after="40" w:line="252" w:lineRule="auto"/>
-      </w:pPr>
-      <w:r>
-        <w:rPr>
-          <w:rFonts w:ascii="Aptos" w:hAnsi="Aptos" w:eastAsia="Aptos"/>
-          <w:b w:val="0"/>
-          <w:i w:val="0"/>
-          <w:color w:val="9CA3AF"/>
-          <w:sz w:val="18"/>
-        </w:rPr>
-        <w:t>................................................................................................................................</w:t>
-      </w:r>
-    </w:p>
-    <w:p>
-      <w:pPr>
-        <w:pStyle w:val="Heading2"/>
-      </w:pPr>
-      <w:r>
-        <w:rPr>
-          <w:rFonts w:ascii="Aptos" w:hAnsi="Aptos" w:eastAsia="Aptos"/>
-          <w:b/>
-          <w:i w:val="0"/>
-          <w:color w:val="000000"/>
-          <w:sz w:val="23"/>
-        </w:rPr>
-        <w:t>Na koniec</w:t>
-      </w:r>
-    </w:p>
-    <w:p>
-      <w:pPr>
-        <w:keepNext w:val="0"/>
-        <w:spacing w:before="0" w:after="60" w:line="252" w:lineRule="auto"/>
-      </w:pPr>
-      <w:r>
-        <w:rPr>
-          <w:rFonts w:ascii="Aptos" w:hAnsi="Aptos" w:eastAsia="Aptos"/>
-          <w:b/>
-          <w:i w:val="0"/>
-          <w:color w:val="1F2937"/>
-          <w:sz w:val="19"/>
-        </w:rPr>
-        <w:t xml:space="preserve">Zaznacz: </w:t>
-      </w:r>
-      <w:r>
-        <w:rPr>
-          <w:rFonts w:ascii="Aptos" w:hAnsi="Aptos" w:eastAsia="Aptos"/>
-          <w:b w:val="0"/>
-          <w:i w:val="0"/>
-          <w:color w:val="1F2937"/>
-          <w:sz w:val="19"/>
-        </w:rPr>
-        <w:t>□ pracowałem samodzielnie   □ potrzebowałem podpowiedzi   □ chcę przećwiczyć to jeszcze raz</w:t>
-      </w:r>
-    </w:p>
-    <w:p>
-      <w:pPr>
-        <w:keepNext w:val="0"/>
-        <w:spacing w:before="0" w:after="20" w:line="252" w:lineRule="auto"/>
-      </w:pPr>
-      <w:r>
-        <w:rPr>
-          <w:rFonts w:ascii="Aptos" w:hAnsi="Aptos" w:eastAsia="Aptos"/>
-          <w:b/>
-          <w:i w:val="0"/>
-          <w:color w:val="1F2937"/>
-          <w:sz w:val="19"/>
-        </w:rPr>
-        <w:t>Jedno zadanie, które teraz rozumiem lepiej:</w:t>
-      </w:r>
-    </w:p>
-    <w:p>
-      <w:pPr>
-        <w:keepNext w:val="0"/>
-        <w:spacing w:before="0" w:after="0" w:line="252" w:lineRule="auto"/>
-      </w:pPr>
-      <w:r>
-        <w:rPr>
-          <w:rFonts w:ascii="Aptos" w:hAnsi="Aptos" w:eastAsia="Aptos"/>
-          <w:b w:val="0"/>
-          <w:i w:val="0"/>
-          <w:color w:val="9CA3AF"/>
-          <w:sz w:val="18"/>
-        </w:rPr>
-        <w:t>................................................................................................................................</w:t>
-      </w:r>
-    </w:p>
-    <w:p>
-      <w:pPr>
-        <w:keepNext w:val="0"/>
-        <w:spacing w:before="0" w:after="0" w:line="252" w:lineRule="auto"/>
-      </w:pPr>
-      <w:r>
-        <w:rPr>
-          <w:rFonts w:ascii="Aptos" w:hAnsi="Aptos" w:eastAsia="Aptos"/>
-          <w:b w:val="0"/>
-          <w:i w:val="0"/>
-          <w:color w:val="9CA3AF"/>
-          <w:sz w:val="18"/>
-        </w:rPr>
-        <w:t>................................................................................................................................</w:t>
-      </w:r>
-    </w:p>
+    <w:tbl>
+      <w:tblPr>
+        <w:tblW w:type="auto" w:w="0"/>
+        <w:jc w:val="center"/>
+        <w:tblLook w:firstColumn="1" w:firstRow="1" w:lastColumn="0" w:lastRow="0" w:noHBand="0" w:noVBand="1" w:val="04A0"/>
+      </w:tblPr>
+      <w:tblGrid>
+        <w:gridCol w:w="10148"/>
+      </w:tblGrid>
+      <w:tr>
+        <w:tc>
+          <w:tcPr>
+            <w:tcW w:type="dxa" w:w="9978"/>
+            <w:shd w:fill="F4F8FB"/>
+            <w:tcBorders>
+              <w:top w:val="dashed" w:sz="10" w:space="0" w:color="1F4E78"/>
+              <w:left w:val="dashed" w:sz="10" w:space="0" w:color="1F4E78"/>
+              <w:bottom w:val="dashed" w:sz="10" w:space="0" w:color="1F4E78"/>
+              <w:right w:val="dashed" w:sz="10" w:space="0" w:color="1F4E78"/>
+              <w:insideH w:val="dashed" w:sz="10" w:space="0" w:color="1F4E78"/>
+              <w:insideV w:val="dashed" w:sz="10" w:space="0" w:color="1F4E78"/>
+            </w:tcBorders>
+            <w:tcMar>
+              <w:top w:w="120" w:type="dxa"/>
+              <w:start w:w="180" w:type="dxa"/>
+              <w:bottom w:w="140" w:type="dxa"/>
+              <w:end w:w="180" w:type="dxa"/>
+            </w:tcMar>
+          </w:tcPr>
+          <w:p>
+            <w:pPr>
+              <w:keepNext w:val="0"/>
+              <w:spacing w:before="0" w:after="80" w:line="252" w:lineRule="auto"/>
+            </w:pPr>
+            <w:r>
+              <w:rPr>
+                <w:rFonts w:ascii="Aptos" w:hAnsi="Aptos" w:eastAsia="Aptos"/>
+                <w:b/>
+                <w:i w:val="0"/>
+                <w:color w:val="1F4E78"/>
+                <w:sz w:val="23"/>
+              </w:rPr>
+              <w:t xml:space="preserve">Po wspólnym sprawdzeniu </w:t>
+            </w:r>
+            <w:r>
+              <w:rPr>
+                <w:rFonts w:ascii="Aptos" w:hAnsi="Aptos" w:eastAsia="Aptos"/>
+                <w:b w:val="0"/>
+                <w:i w:val="0"/>
+                <w:color w:val="4B5563"/>
+                <w:sz w:val="19"/>
+              </w:rPr>
+              <w:t>- tę część robimy razem na końcu lekcji</w:t>
+            </w:r>
+          </w:p>
+          <w:p>
+            <w:pPr>
+              <w:keepNext w:val="0"/>
+              <w:spacing w:before="0" w:after="40" w:line="252" w:lineRule="auto"/>
+            </w:pPr>
+            <w:r>
+              <w:rPr>
+                <w:rFonts w:ascii="Aptos" w:hAnsi="Aptos" w:eastAsia="Aptos"/>
+                <w:b/>
+                <w:i w:val="0"/>
+                <w:color w:val="1F2937"/>
+                <w:sz w:val="20"/>
+              </w:rPr>
+              <w:t xml:space="preserve">1. Policz plusy. </w:t>
+            </w:r>
+            <w:r>
+              <w:rPr>
+                <w:rFonts w:ascii="Aptos" w:hAnsi="Aptos" w:eastAsia="Aptos"/>
+                <w:b w:val="0"/>
+                <w:i w:val="0"/>
+                <w:color w:val="1F2937"/>
+                <w:sz w:val="20"/>
+              </w:rPr>
+              <w:t>Przy sprawdzaniu postaw + pod numerem każdego dobrze zrobionego zadania.</w:t>
+            </w:r>
+          </w:p>
+          <w:tbl>
+            <w:tblPr>
+              <w:tblW w:type="auto" w:w="0"/>
+              <w:tblLayout w:type="fixed"/>
+              <w:tblLook w:firstColumn="1" w:firstRow="1" w:lastColumn="0" w:lastRow="0" w:noHBand="0" w:noVBand="1" w:val="04A0"/>
+            </w:tblPr>
+            <w:tblGrid>
+              <w:gridCol w:w="713"/>
+              <w:gridCol w:w="713"/>
+              <w:gridCol w:w="713"/>
+              <w:gridCol w:w="713"/>
+              <w:gridCol w:w="713"/>
+              <w:gridCol w:w="713"/>
+              <w:gridCol w:w="713"/>
+              <w:gridCol w:w="713"/>
+              <w:gridCol w:w="713"/>
+              <w:gridCol w:w="713"/>
+              <w:gridCol w:w="713"/>
+              <w:gridCol w:w="713"/>
+              <w:gridCol w:w="713"/>
+              <w:gridCol w:w="713"/>
+            </w:tblGrid>
+            <w:tr>
+              <w:tc>
+                <w:tcPr>
+                  <w:tcW w:type="dxa" w:w="964"/>
+                  <w:tcBorders>
+                    <w:top w:val="single" w:sz="7" w:space="0" w:color="9CA3AF"/>
+                    <w:left w:val="single" w:sz="7" w:space="0" w:color="9CA3AF"/>
+                    <w:bottom w:val="single" w:sz="7" w:space="0" w:color="9CA3AF"/>
+                    <w:right w:val="single" w:sz="7" w:space="0" w:color="9CA3AF"/>
+                    <w:insideH w:val="single" w:sz="7" w:space="0" w:color="9CA3AF"/>
+                    <w:insideV w:val="single" w:sz="7" w:space="0" w:color="9CA3AF"/>
+                  </w:tcBorders>
+                  <w:tcMar>
+                    <w:top w:w="40" w:type="dxa"/>
+                    <w:start w:w="40" w:type="dxa"/>
+                    <w:bottom w:w="40" w:type="dxa"/>
+                    <w:end w:w="40" w:type="dxa"/>
+                  </w:tcMar>
+                  <w:shd w:fill="EAF3F8"/>
+                </w:tcPr>
+                <w:p>
+                  <w:pPr>
+                    <w:keepNext w:val="0"/>
+                    <w:spacing w:before="0" w:after="0" w:line="240" w:lineRule="auto"/>
+                    <w:jc w:val="center"/>
+                  </w:pPr>
+                  <w:r>
+                    <w:rPr>
+                      <w:rFonts w:ascii="Aptos" w:hAnsi="Aptos" w:eastAsia="Aptos"/>
+                      <w:b w:val="0"/>
+                      <w:i w:val="0"/>
+                      <w:color w:val="1F2937"/>
+                      <w:sz w:val="19"/>
+                    </w:rPr>
+                    <w:t>zadanie</w:t>
+                  </w:r>
+                </w:p>
+              </w:tc>
+              <w:tc>
+                <w:tcPr>
+                  <w:tcW w:type="dxa" w:w="539"/>
+                  <w:tcBorders>
+                    <w:top w:val="single" w:sz="7" w:space="0" w:color="9CA3AF"/>
+                    <w:left w:val="single" w:sz="7" w:space="0" w:color="9CA3AF"/>
+                    <w:bottom w:val="single" w:sz="7" w:space="0" w:color="9CA3AF"/>
+                    <w:right w:val="single" w:sz="7" w:space="0" w:color="9CA3AF"/>
+                    <w:insideH w:val="single" w:sz="7" w:space="0" w:color="9CA3AF"/>
+                    <w:insideV w:val="single" w:sz="7" w:space="0" w:color="9CA3AF"/>
+                  </w:tcBorders>
+                  <w:tcMar>
+                    <w:top w:w="40" w:type="dxa"/>
+                    <w:start w:w="40" w:type="dxa"/>
+                    <w:bottom w:w="40" w:type="dxa"/>
+                    <w:end w:w="40" w:type="dxa"/>
+                  </w:tcMar>
+                  <w:shd w:fill="FFFFFF"/>
+                </w:tcPr>
+                <w:p>
+                  <w:pPr>
+                    <w:keepNext w:val="0"/>
+                    <w:spacing w:before="0" w:after="0" w:line="240" w:lineRule="auto"/>
+                    <w:jc w:val="center"/>
+                  </w:pPr>
+                  <w:r>
+                    <w:rPr>
+                      <w:rFonts w:ascii="Aptos" w:hAnsi="Aptos" w:eastAsia="Aptos"/>
+                      <w:b/>
+                      <w:i w:val="0"/>
+                      <w:color w:val="1F4E78"/>
+                      <w:sz w:val="19"/>
+                    </w:rPr>
+                    <w:t>1</w:t>
+                  </w:r>
+                </w:p>
+              </w:tc>
+              <w:tc>
+                <w:tcPr>
+                  <w:tcW w:type="dxa" w:w="539"/>
+                  <w:tcBorders>
+                    <w:top w:val="single" w:sz="7" w:space="0" w:color="9CA3AF"/>
+                    <w:left w:val="single" w:sz="7" w:space="0" w:color="9CA3AF"/>
+                    <w:bottom w:val="single" w:sz="7" w:space="0" w:color="9CA3AF"/>
+                    <w:right w:val="single" w:sz="7" w:space="0" w:color="9CA3AF"/>
+                    <w:insideH w:val="single" w:sz="7" w:space="0" w:color="9CA3AF"/>
+                    <w:insideV w:val="single" w:sz="7" w:space="0" w:color="9CA3AF"/>
+                  </w:tcBorders>
+                  <w:tcMar>
+                    <w:top w:w="40" w:type="dxa"/>
+                    <w:start w:w="40" w:type="dxa"/>
+                    <w:bottom w:w="40" w:type="dxa"/>
+                    <w:end w:w="40" w:type="dxa"/>
+                  </w:tcMar>
+                  <w:shd w:fill="FFFFFF"/>
+                </w:tcPr>
+                <w:p>
+                  <w:pPr>
+                    <w:keepNext w:val="0"/>
+                    <w:spacing w:before="0" w:after="0" w:line="240" w:lineRule="auto"/>
+                    <w:jc w:val="center"/>
+                  </w:pPr>
+                  <w:r>
+                    <w:rPr>
+                      <w:rFonts w:ascii="Aptos" w:hAnsi="Aptos" w:eastAsia="Aptos"/>
+                      <w:b/>
+                      <w:i w:val="0"/>
+                      <w:color w:val="1F4E78"/>
+                      <w:sz w:val="19"/>
+                    </w:rPr>
+                    <w:t>2</w:t>
+                  </w:r>
+                </w:p>
+              </w:tc>
+              <w:tc>
+                <w:tcPr>
+                  <w:tcW w:type="dxa" w:w="539"/>
+                  <w:tcBorders>
+                    <w:top w:val="single" w:sz="7" w:space="0" w:color="9CA3AF"/>
+                    <w:left w:val="single" w:sz="7" w:space="0" w:color="9CA3AF"/>
+                    <w:bottom w:val="single" w:sz="7" w:space="0" w:color="9CA3AF"/>
+                    <w:right w:val="single" w:sz="7" w:space="0" w:color="9CA3AF"/>
+                    <w:insideH w:val="single" w:sz="7" w:space="0" w:color="9CA3AF"/>
+                    <w:insideV w:val="single" w:sz="7" w:space="0" w:color="9CA3AF"/>
+                  </w:tcBorders>
+                  <w:tcMar>
+                    <w:top w:w="40" w:type="dxa"/>
+                    <w:start w:w="40" w:type="dxa"/>
+                    <w:bottom w:w="40" w:type="dxa"/>
+                    <w:end w:w="40" w:type="dxa"/>
+                  </w:tcMar>
+                  <w:shd w:fill="FFFFFF"/>
+                </w:tcPr>
+                <w:p>
+                  <w:pPr>
+                    <w:keepNext w:val="0"/>
+                    <w:spacing w:before="0" w:after="0" w:line="240" w:lineRule="auto"/>
+                    <w:jc w:val="center"/>
+                  </w:pPr>
+                  <w:r>
+                    <w:rPr>
+                      <w:rFonts w:ascii="Aptos" w:hAnsi="Aptos" w:eastAsia="Aptos"/>
+                      <w:b/>
+                      <w:i w:val="0"/>
+                      <w:color w:val="1F4E78"/>
+                      <w:sz w:val="19"/>
+                    </w:rPr>
+                    <w:t>3</w:t>
+                  </w:r>
+                </w:p>
+              </w:tc>
+              <w:tc>
+                <w:tcPr>
+                  <w:tcW w:type="dxa" w:w="539"/>
+                  <w:tcBorders>
+                    <w:top w:val="single" w:sz="7" w:space="0" w:color="9CA3AF"/>
+                    <w:left w:val="single" w:sz="7" w:space="0" w:color="9CA3AF"/>
+                    <w:bottom w:val="single" w:sz="7" w:space="0" w:color="9CA3AF"/>
+                    <w:right w:val="single" w:sz="7" w:space="0" w:color="9CA3AF"/>
+                    <w:insideH w:val="single" w:sz="7" w:space="0" w:color="9CA3AF"/>
+                    <w:insideV w:val="single" w:sz="7" w:space="0" w:color="9CA3AF"/>
+                  </w:tcBorders>
+                  <w:tcMar>
+                    <w:top w:w="40" w:type="dxa"/>
+                    <w:start w:w="40" w:type="dxa"/>
+                    <w:bottom w:w="40" w:type="dxa"/>
+                    <w:end w:w="40" w:type="dxa"/>
+                  </w:tcMar>
+                  <w:shd w:fill="FFFFFF"/>
+                </w:tcPr>
+                <w:p>
+                  <w:pPr>
+                    <w:keepNext w:val="0"/>
+                    <w:spacing w:before="0" w:after="0" w:line="240" w:lineRule="auto"/>
+                    <w:jc w:val="center"/>
+                  </w:pPr>
+                  <w:r>
+                    <w:rPr>
+                      <w:rFonts w:ascii="Aptos" w:hAnsi="Aptos" w:eastAsia="Aptos"/>
+                      <w:b/>
+                      <w:i w:val="0"/>
+                      <w:color w:val="1F4E78"/>
+                      <w:sz w:val="19"/>
+                    </w:rPr>
+                    <w:t>4</w:t>
+                  </w:r>
+                </w:p>
+              </w:tc>
+              <w:tc>
+                <w:tcPr>
+                  <w:tcW w:type="dxa" w:w="539"/>
+                  <w:tcBorders>
+                    <w:top w:val="single" w:sz="7" w:space="0" w:color="9CA3AF"/>
+                    <w:left w:val="single" w:sz="7" w:space="0" w:color="9CA3AF"/>
+                    <w:bottom w:val="single" w:sz="7" w:space="0" w:color="9CA3AF"/>
+                    <w:right w:val="single" w:sz="7" w:space="0" w:color="9CA3AF"/>
+                    <w:insideH w:val="single" w:sz="7" w:space="0" w:color="9CA3AF"/>
+                    <w:insideV w:val="single" w:sz="7" w:space="0" w:color="9CA3AF"/>
+                  </w:tcBorders>
+                  <w:tcMar>
+                    <w:top w:w="40" w:type="dxa"/>
+                    <w:start w:w="40" w:type="dxa"/>
+                    <w:bottom w:w="40" w:type="dxa"/>
+                    <w:end w:w="40" w:type="dxa"/>
+                  </w:tcMar>
+                  <w:shd w:fill="FFFFFF"/>
+                </w:tcPr>
+                <w:p>
+                  <w:pPr>
+                    <w:keepNext w:val="0"/>
+                    <w:spacing w:before="0" w:after="0" w:line="240" w:lineRule="auto"/>
+                    <w:jc w:val="center"/>
+                  </w:pPr>
+                  <w:r>
+                    <w:rPr>
+                      <w:rFonts w:ascii="Aptos" w:hAnsi="Aptos" w:eastAsia="Aptos"/>
+                      <w:b/>
+                      <w:i w:val="0"/>
+                      <w:color w:val="1F4E78"/>
+                      <w:sz w:val="19"/>
+                    </w:rPr>
+                    <w:t>5</w:t>
+                  </w:r>
+                </w:p>
+              </w:tc>
+              <w:tc>
+                <w:tcPr>
+                  <w:tcW w:type="dxa" w:w="539"/>
+                  <w:tcBorders>
+                    <w:top w:val="single" w:sz="7" w:space="0" w:color="9CA3AF"/>
+                    <w:left w:val="single" w:sz="7" w:space="0" w:color="9CA3AF"/>
+                    <w:bottom w:val="single" w:sz="7" w:space="0" w:color="9CA3AF"/>
+                    <w:right w:val="single" w:sz="7" w:space="0" w:color="9CA3AF"/>
+                    <w:insideH w:val="single" w:sz="7" w:space="0" w:color="9CA3AF"/>
+                    <w:insideV w:val="single" w:sz="7" w:space="0" w:color="9CA3AF"/>
+                  </w:tcBorders>
+                  <w:tcMar>
+                    <w:top w:w="40" w:type="dxa"/>
+                    <w:start w:w="40" w:type="dxa"/>
+                    <w:bottom w:w="40" w:type="dxa"/>
+                    <w:end w:w="40" w:type="dxa"/>
+                  </w:tcMar>
+                  <w:shd w:fill="FFFFFF"/>
+                </w:tcPr>
+                <w:p>
+                  <w:pPr>
+                    <w:keepNext w:val="0"/>
+                    <w:spacing w:before="0" w:after="0" w:line="240" w:lineRule="auto"/>
+                    <w:jc w:val="center"/>
+                  </w:pPr>
+                  <w:r>
+                    <w:rPr>
+                      <w:rFonts w:ascii="Aptos" w:hAnsi="Aptos" w:eastAsia="Aptos"/>
+                      <w:b/>
+                      <w:i w:val="0"/>
+                      <w:color w:val="1F4E78"/>
+                      <w:sz w:val="19"/>
+                    </w:rPr>
+                    <w:t>6</w:t>
+                  </w:r>
+                </w:p>
+              </w:tc>
+              <w:tc>
+                <w:tcPr>
+                  <w:tcW w:type="dxa" w:w="539"/>
+                  <w:tcBorders>
+                    <w:top w:val="single" w:sz="7" w:space="0" w:color="9CA3AF"/>
+                    <w:left w:val="single" w:sz="7" w:space="0" w:color="9CA3AF"/>
+                    <w:bottom w:val="single" w:sz="7" w:space="0" w:color="9CA3AF"/>
+                    <w:right w:val="single" w:sz="7" w:space="0" w:color="9CA3AF"/>
+                    <w:insideH w:val="single" w:sz="7" w:space="0" w:color="9CA3AF"/>
+                    <w:insideV w:val="single" w:sz="7" w:space="0" w:color="9CA3AF"/>
+                  </w:tcBorders>
+                  <w:tcMar>
+                    <w:top w:w="40" w:type="dxa"/>
+                    <w:start w:w="40" w:type="dxa"/>
+                    <w:bottom w:w="40" w:type="dxa"/>
+                    <w:end w:w="40" w:type="dxa"/>
+                  </w:tcMar>
+                  <w:shd w:fill="FFFFFF"/>
+                </w:tcPr>
+                <w:p>
+                  <w:pPr>
+                    <w:keepNext w:val="0"/>
+                    <w:spacing w:before="0" w:after="0" w:line="240" w:lineRule="auto"/>
+                    <w:jc w:val="center"/>
+                  </w:pPr>
+                  <w:r>
+                    <w:rPr>
+                      <w:rFonts w:ascii="Aptos" w:hAnsi="Aptos" w:eastAsia="Aptos"/>
+                      <w:b/>
+                      <w:i w:val="0"/>
+                      <w:color w:val="1F4E78"/>
+                      <w:sz w:val="19"/>
+                    </w:rPr>
+                    <w:t>7</w:t>
+                  </w:r>
+                </w:p>
+              </w:tc>
+              <w:tc>
+                <w:tcPr>
+                  <w:tcW w:type="dxa" w:w="539"/>
+                  <w:tcBorders>
+                    <w:top w:val="single" w:sz="7" w:space="0" w:color="9CA3AF"/>
+                    <w:left w:val="single" w:sz="7" w:space="0" w:color="9CA3AF"/>
+                    <w:bottom w:val="single" w:sz="7" w:space="0" w:color="9CA3AF"/>
+                    <w:right w:val="single" w:sz="7" w:space="0" w:color="9CA3AF"/>
+                    <w:insideH w:val="single" w:sz="7" w:space="0" w:color="9CA3AF"/>
+                    <w:insideV w:val="single" w:sz="7" w:space="0" w:color="9CA3AF"/>
+                  </w:tcBorders>
+                  <w:tcMar>
+                    <w:top w:w="40" w:type="dxa"/>
+                    <w:start w:w="40" w:type="dxa"/>
+                    <w:bottom w:w="40" w:type="dxa"/>
+                    <w:end w:w="40" w:type="dxa"/>
+                  </w:tcMar>
+                  <w:shd w:fill="FFFFFF"/>
+                </w:tcPr>
+                <w:p>
+                  <w:pPr>
+                    <w:keepNext w:val="0"/>
+                    <w:spacing w:before="0" w:after="0" w:line="240" w:lineRule="auto"/>
+                    <w:jc w:val="center"/>
+                  </w:pPr>
+                  <w:r>
+                    <w:rPr>
+                      <w:rFonts w:ascii="Aptos" w:hAnsi="Aptos" w:eastAsia="Aptos"/>
+                      <w:b/>
+                      <w:i w:val="0"/>
+                      <w:color w:val="1F4E78"/>
+                      <w:sz w:val="19"/>
+                    </w:rPr>
+                    <w:t>8</w:t>
+                  </w:r>
+                </w:p>
+              </w:tc>
+              <w:tc>
+                <w:tcPr>
+                  <w:tcW w:type="dxa" w:w="539"/>
+                  <w:tcBorders>
+                    <w:top w:val="single" w:sz="7" w:space="0" w:color="9CA3AF"/>
+                    <w:left w:val="single" w:sz="7" w:space="0" w:color="9CA3AF"/>
+                    <w:bottom w:val="single" w:sz="7" w:space="0" w:color="9CA3AF"/>
+                    <w:right w:val="single" w:sz="7" w:space="0" w:color="9CA3AF"/>
+                    <w:insideH w:val="single" w:sz="7" w:space="0" w:color="9CA3AF"/>
+                    <w:insideV w:val="single" w:sz="7" w:space="0" w:color="9CA3AF"/>
+                  </w:tcBorders>
+                  <w:tcMar>
+                    <w:top w:w="40" w:type="dxa"/>
+                    <w:start w:w="40" w:type="dxa"/>
+                    <w:bottom w:w="40" w:type="dxa"/>
+                    <w:end w:w="40" w:type="dxa"/>
+                  </w:tcMar>
+                  <w:shd w:fill="FFFFFF"/>
+                </w:tcPr>
+                <w:p>
+                  <w:pPr>
+                    <w:keepNext w:val="0"/>
+                    <w:spacing w:before="0" w:after="0" w:line="240" w:lineRule="auto"/>
+                    <w:jc w:val="center"/>
+                  </w:pPr>
+                  <w:r>
+                    <w:rPr>
+                      <w:rFonts w:ascii="Aptos" w:hAnsi="Aptos" w:eastAsia="Aptos"/>
+                      <w:b/>
+                      <w:i w:val="0"/>
+                      <w:color w:val="1F4E78"/>
+                      <w:sz w:val="19"/>
+                    </w:rPr>
+                    <w:t>9</w:t>
+                  </w:r>
+                </w:p>
+              </w:tc>
+              <w:tc>
+                <w:tcPr>
+                  <w:tcW w:type="dxa" w:w="539"/>
+                  <w:tcBorders>
+                    <w:top w:val="single" w:sz="7" w:space="0" w:color="9CA3AF"/>
+                    <w:left w:val="single" w:sz="7" w:space="0" w:color="9CA3AF"/>
+                    <w:bottom w:val="single" w:sz="7" w:space="0" w:color="9CA3AF"/>
+                    <w:right w:val="single" w:sz="7" w:space="0" w:color="9CA3AF"/>
+                    <w:insideH w:val="single" w:sz="7" w:space="0" w:color="9CA3AF"/>
+                    <w:insideV w:val="single" w:sz="7" w:space="0" w:color="9CA3AF"/>
+                  </w:tcBorders>
+                  <w:tcMar>
+                    <w:top w:w="40" w:type="dxa"/>
+                    <w:start w:w="40" w:type="dxa"/>
+                    <w:bottom w:w="40" w:type="dxa"/>
+                    <w:end w:w="40" w:type="dxa"/>
+                  </w:tcMar>
+                  <w:shd w:fill="FFFFFF"/>
+                </w:tcPr>
+                <w:p>
+                  <w:pPr>
+                    <w:keepNext w:val="0"/>
+                    <w:spacing w:before="0" w:after="0" w:line="240" w:lineRule="auto"/>
+                    <w:jc w:val="center"/>
+                  </w:pPr>
+                  <w:r>
+                    <w:rPr>
+                      <w:rFonts w:ascii="Aptos" w:hAnsi="Aptos" w:eastAsia="Aptos"/>
+                      <w:b/>
+                      <w:i w:val="0"/>
+                      <w:color w:val="1F4E78"/>
+                      <w:sz w:val="19"/>
+                    </w:rPr>
+                    <w:t>10</w:t>
+                  </w:r>
+                </w:p>
+              </w:tc>
+              <w:tc>
+                <w:tcPr>
+                  <w:tcW w:type="dxa" w:w="539"/>
+                  <w:tcBorders>
+                    <w:top w:val="single" w:sz="7" w:space="0" w:color="9CA3AF"/>
+                    <w:left w:val="single" w:sz="7" w:space="0" w:color="9CA3AF"/>
+                    <w:bottom w:val="single" w:sz="7" w:space="0" w:color="9CA3AF"/>
+                    <w:right w:val="single" w:sz="7" w:space="0" w:color="9CA3AF"/>
+                    <w:insideH w:val="single" w:sz="7" w:space="0" w:color="9CA3AF"/>
+                    <w:insideV w:val="single" w:sz="7" w:space="0" w:color="9CA3AF"/>
+                  </w:tcBorders>
+                  <w:tcMar>
+                    <w:top w:w="40" w:type="dxa"/>
+                    <w:start w:w="40" w:type="dxa"/>
+                    <w:bottom w:w="40" w:type="dxa"/>
+                    <w:end w:w="40" w:type="dxa"/>
+                  </w:tcMar>
+                  <w:shd w:fill="FFFFFF"/>
+                </w:tcPr>
+                <w:p>
+                  <w:pPr>
+                    <w:keepNext w:val="0"/>
+                    <w:spacing w:before="0" w:after="0" w:line="240" w:lineRule="auto"/>
+                    <w:jc w:val="center"/>
+                  </w:pPr>
+                  <w:r>
+                    <w:rPr>
+                      <w:rFonts w:ascii="Aptos" w:hAnsi="Aptos" w:eastAsia="Aptos"/>
+                      <w:b/>
+                      <w:i w:val="0"/>
+                      <w:color w:val="1F4E78"/>
+                      <w:sz w:val="19"/>
+                    </w:rPr>
+                    <w:t>11</w:t>
+                  </w:r>
+                </w:p>
+              </w:tc>
+              <w:tc>
+                <w:tcPr>
+                  <w:tcW w:type="dxa" w:w="539"/>
+                  <w:tcBorders>
+                    <w:top w:val="single" w:sz="7" w:space="0" w:color="9CA3AF"/>
+                    <w:left w:val="single" w:sz="7" w:space="0" w:color="9CA3AF"/>
+                    <w:bottom w:val="single" w:sz="7" w:space="0" w:color="9CA3AF"/>
+                    <w:right w:val="single" w:sz="7" w:space="0" w:color="9CA3AF"/>
+                    <w:insideH w:val="single" w:sz="7" w:space="0" w:color="9CA3AF"/>
+                    <w:insideV w:val="single" w:sz="7" w:space="0" w:color="9CA3AF"/>
+                  </w:tcBorders>
+                  <w:tcMar>
+                    <w:top w:w="40" w:type="dxa"/>
+                    <w:start w:w="40" w:type="dxa"/>
+                    <w:bottom w:w="40" w:type="dxa"/>
+                    <w:end w:w="40" w:type="dxa"/>
+                  </w:tcMar>
+                  <w:shd w:fill="FFFFFF"/>
+                </w:tcPr>
+                <w:p>
+                  <w:pPr>
+                    <w:keepNext w:val="0"/>
+                    <w:spacing w:before="0" w:after="0" w:line="240" w:lineRule="auto"/>
+                    <w:jc w:val="center"/>
+                  </w:pPr>
+                  <w:r>
+                    <w:rPr>
+                      <w:rFonts w:ascii="Aptos" w:hAnsi="Aptos" w:eastAsia="Aptos"/>
+                      <w:b/>
+                      <w:i w:val="0"/>
+                      <w:color w:val="1F4E78"/>
+                      <w:sz w:val="19"/>
+                    </w:rPr>
+                    <w:t>12</w:t>
+                  </w:r>
+                </w:p>
+              </w:tc>
+              <w:tc>
+                <w:tcPr>
+                  <w:tcW w:type="dxa" w:w="1077"/>
+                  <w:tcBorders>
+                    <w:top w:val="single" w:sz="7" w:space="0" w:color="9CA3AF"/>
+                    <w:left w:val="single" w:sz="7" w:space="0" w:color="9CA3AF"/>
+                    <w:bottom w:val="single" w:sz="7" w:space="0" w:color="9CA3AF"/>
+                    <w:right w:val="single" w:sz="7" w:space="0" w:color="9CA3AF"/>
+                    <w:insideH w:val="single" w:sz="7" w:space="0" w:color="9CA3AF"/>
+                    <w:insideV w:val="single" w:sz="7" w:space="0" w:color="9CA3AF"/>
+                  </w:tcBorders>
+                  <w:tcMar>
+                    <w:top w:w="40" w:type="dxa"/>
+                    <w:start w:w="40" w:type="dxa"/>
+                    <w:bottom w:w="40" w:type="dxa"/>
+                    <w:end w:w="40" w:type="dxa"/>
+                  </w:tcMar>
+                  <w:shd w:fill="EAF3F8"/>
+                </w:tcPr>
+                <w:p>
+                  <w:pPr>
+                    <w:keepNext w:val="0"/>
+                    <w:spacing w:before="0" w:after="0" w:line="240" w:lineRule="auto"/>
+                    <w:jc w:val="center"/>
+                  </w:pPr>
+                  <w:r>
+                    <w:rPr>
+                      <w:rFonts w:ascii="Aptos" w:hAnsi="Aptos" w:eastAsia="Aptos"/>
+                      <w:b w:val="0"/>
+                      <w:i w:val="0"/>
+                      <w:color w:val="1F2937"/>
+                      <w:sz w:val="19"/>
+                    </w:rPr>
+                    <w:t>razem</w:t>
+                  </w:r>
+                </w:p>
+              </w:tc>
+            </w:tr>
+            <w:tr>
+              <w:tc>
+                <w:tcPr>
+                  <w:tcW w:type="dxa" w:w="964"/>
+                  <w:tcBorders>
+                    <w:top w:val="single" w:sz="7" w:space="0" w:color="9CA3AF"/>
+                    <w:left w:val="single" w:sz="7" w:space="0" w:color="9CA3AF"/>
+                    <w:bottom w:val="single" w:sz="7" w:space="0" w:color="9CA3AF"/>
+                    <w:right w:val="single" w:sz="7" w:space="0" w:color="9CA3AF"/>
+                    <w:insideH w:val="single" w:sz="7" w:space="0" w:color="9CA3AF"/>
+                    <w:insideV w:val="single" w:sz="7" w:space="0" w:color="9CA3AF"/>
+                  </w:tcBorders>
+                  <w:tcMar>
+                    <w:top w:w="110" w:type="dxa"/>
+                    <w:start w:w="40" w:type="dxa"/>
+                    <w:bottom w:w="110" w:type="dxa"/>
+                    <w:end w:w="40" w:type="dxa"/>
+                  </w:tcMar>
+                  <w:shd w:fill="EAF3F8"/>
+                </w:tcPr>
+                <w:p>
+                  <w:pPr>
+                    <w:keepNext w:val="0"/>
+                    <w:spacing w:before="0" w:after="0" w:line="240" w:lineRule="auto"/>
+                    <w:jc w:val="center"/>
+                  </w:pPr>
+                  <w:r>
+                    <w:rPr>
+                      <w:rFonts w:ascii="Aptos" w:hAnsi="Aptos" w:eastAsia="Aptos"/>
+                      <w:b w:val="0"/>
+                      <w:i w:val="0"/>
+                      <w:color w:val="1F2937"/>
+                      <w:sz w:val="19"/>
+                    </w:rPr>
+                    <w:t>+</w:t>
+                  </w:r>
+                </w:p>
+              </w:tc>
+              <w:tc>
+                <w:tcPr>
+                  <w:tcW w:type="dxa" w:w="539"/>
+                  <w:tcBorders>
+                    <w:top w:val="single" w:sz="7" w:space="0" w:color="9CA3AF"/>
+                    <w:left w:val="single" w:sz="7" w:space="0" w:color="9CA3AF"/>
+                    <w:bottom w:val="single" w:sz="7" w:space="0" w:color="9CA3AF"/>
+                    <w:right w:val="single" w:sz="7" w:space="0" w:color="9CA3AF"/>
+                    <w:insideH w:val="single" w:sz="7" w:space="0" w:color="9CA3AF"/>
+                    <w:insideV w:val="single" w:sz="7" w:space="0" w:color="9CA3AF"/>
+                  </w:tcBorders>
+                  <w:tcMar>
+                    <w:top w:w="110" w:type="dxa"/>
+                    <w:start w:w="40" w:type="dxa"/>
+                    <w:bottom w:w="110" w:type="dxa"/>
+                    <w:end w:w="40" w:type="dxa"/>
+                  </w:tcMar>
+                  <w:shd w:fill="FFFFFF"/>
+                </w:tcPr>
+                <w:p>
+                  <w:pPr>
+                    <w:keepNext w:val="0"/>
+                    <w:spacing w:before="0" w:after="0" w:line="240" w:lineRule="auto"/>
+                    <w:jc w:val="center"/>
+                  </w:pPr>
+                  <w:r>
+                    <w:rPr>
+                      <w:rFonts w:ascii="Aptos" w:hAnsi="Aptos" w:eastAsia="Aptos"/>
+                      <w:b w:val="0"/>
+                      <w:i w:val="0"/>
+                      <w:color w:val="1F2937"/>
+                      <w:sz w:val="19"/>
+                    </w:rPr>
+                  </w:r>
+                </w:p>
+              </w:tc>
+              <w:tc>
+                <w:tcPr>
+                  <w:tcW w:type="dxa" w:w="539"/>
+                  <w:tcBorders>
+                    <w:top w:val="single" w:sz="7" w:space="0" w:color="9CA3AF"/>
+                    <w:left w:val="single" w:sz="7" w:space="0" w:color="9CA3AF"/>
+                    <w:bottom w:val="single" w:sz="7" w:space="0" w:color="9CA3AF"/>
+                    <w:right w:val="single" w:sz="7" w:space="0" w:color="9CA3AF"/>
+                    <w:insideH w:val="single" w:sz="7" w:space="0" w:color="9CA3AF"/>
+                    <w:insideV w:val="single" w:sz="7" w:space="0" w:color="9CA3AF"/>
+                  </w:tcBorders>
+                  <w:tcMar>
+                    <w:top w:w="110" w:type="dxa"/>
+                    <w:start w:w="40" w:type="dxa"/>
+                    <w:bottom w:w="110" w:type="dxa"/>
+                    <w:end w:w="40" w:type="dxa"/>
+                  </w:tcMar>
+                  <w:shd w:fill="FFFFFF"/>
+                </w:tcPr>
+                <w:p>
+                  <w:pPr>
+                    <w:keepNext w:val="0"/>
+                    <w:spacing w:before="0" w:after="0" w:line="240" w:lineRule="auto"/>
+                    <w:jc w:val="center"/>
+                  </w:pPr>
+                  <w:r>
+                    <w:rPr>
+                      <w:rFonts w:ascii="Aptos" w:hAnsi="Aptos" w:eastAsia="Aptos"/>
+                      <w:b w:val="0"/>
+                      <w:i w:val="0"/>
+                      <w:color w:val="1F2937"/>
+                      <w:sz w:val="19"/>
+                    </w:rPr>
+                  </w:r>
+                </w:p>
+              </w:tc>
+              <w:tc>
+                <w:tcPr>
+                  <w:tcW w:type="dxa" w:w="539"/>
+                  <w:tcBorders>
+                    <w:top w:val="single" w:sz="7" w:space="0" w:color="9CA3AF"/>
+                    <w:left w:val="single" w:sz="7" w:space="0" w:color="9CA3AF"/>
+                    <w:bottom w:val="single" w:sz="7" w:space="0" w:color="9CA3AF"/>
+                    <w:right w:val="single" w:sz="7" w:space="0" w:color="9CA3AF"/>
+                    <w:insideH w:val="single" w:sz="7" w:space="0" w:color="9CA3AF"/>
+                    <w:insideV w:val="single" w:sz="7" w:space="0" w:color="9CA3AF"/>
+                  </w:tcBorders>
+                  <w:tcMar>
+                    <w:top w:w="110" w:type="dxa"/>
+                    <w:start w:w="40" w:type="dxa"/>
+                    <w:bottom w:w="110" w:type="dxa"/>
+                    <w:end w:w="40" w:type="dxa"/>
+                  </w:tcMar>
+                  <w:shd w:fill="FFFFFF"/>
+                </w:tcPr>
+                <w:p>
+                  <w:pPr>
+                    <w:keepNext w:val="0"/>
+                    <w:spacing w:before="0" w:after="0" w:line="240" w:lineRule="auto"/>
+                    <w:jc w:val="center"/>
+                  </w:pPr>
+                  <w:r>
+                    <w:rPr>
+                      <w:rFonts w:ascii="Aptos" w:hAnsi="Aptos" w:eastAsia="Aptos"/>
+                      <w:b w:val="0"/>
+                      <w:i w:val="0"/>
+                      <w:color w:val="1F2937"/>
+                      <w:sz w:val="19"/>
+                    </w:rPr>
+                  </w:r>
+                </w:p>
+              </w:tc>
+              <w:tc>
+                <w:tcPr>
+                  <w:tcW w:type="dxa" w:w="539"/>
+                  <w:tcBorders>
+                    <w:top w:val="single" w:sz="7" w:space="0" w:color="9CA3AF"/>
+                    <w:left w:val="single" w:sz="7" w:space="0" w:color="9CA3AF"/>
+                    <w:bottom w:val="single" w:sz="7" w:space="0" w:color="9CA3AF"/>
+                    <w:right w:val="single" w:sz="7" w:space="0" w:color="9CA3AF"/>
+                    <w:insideH w:val="single" w:sz="7" w:space="0" w:color="9CA3AF"/>
+                    <w:insideV w:val="single" w:sz="7" w:space="0" w:color="9CA3AF"/>
+                  </w:tcBorders>
+                  <w:tcMar>
+                    <w:top w:w="110" w:type="dxa"/>
+                    <w:start w:w="40" w:type="dxa"/>
+                    <w:bottom w:w="110" w:type="dxa"/>
+                    <w:end w:w="40" w:type="dxa"/>
+                  </w:tcMar>
+                  <w:shd w:fill="FFFFFF"/>
+                </w:tcPr>
+                <w:p>
+                  <w:pPr>
+                    <w:keepNext w:val="0"/>
+                    <w:spacing w:before="0" w:after="0" w:line="240" w:lineRule="auto"/>
+                    <w:jc w:val="center"/>
+                  </w:pPr>
+                  <w:r>
+                    <w:rPr>
+                      <w:rFonts w:ascii="Aptos" w:hAnsi="Aptos" w:eastAsia="Aptos"/>
+                      <w:b w:val="0"/>
+                      <w:i w:val="0"/>
+                      <w:color w:val="1F2937"/>
+                      <w:sz w:val="19"/>
+                    </w:rPr>
+                  </w:r>
+                </w:p>
+              </w:tc>
+              <w:tc>
+                <w:tcPr>
+                  <w:tcW w:type="dxa" w:w="539"/>
+                  <w:tcBorders>
+                    <w:top w:val="single" w:sz="7" w:space="0" w:color="9CA3AF"/>
+                    <w:left w:val="single" w:sz="7" w:space="0" w:color="9CA3AF"/>
+                    <w:bottom w:val="single" w:sz="7" w:space="0" w:color="9CA3AF"/>
+                    <w:right w:val="single" w:sz="7" w:space="0" w:color="9CA3AF"/>
+                    <w:insideH w:val="single" w:sz="7" w:space="0" w:color="9CA3AF"/>
+                    <w:insideV w:val="single" w:sz="7" w:space="0" w:color="9CA3AF"/>
+                  </w:tcBorders>
+                  <w:tcMar>
+                    <w:top w:w="110" w:type="dxa"/>
+                    <w:start w:w="40" w:type="dxa"/>
+                    <w:bottom w:w="110" w:type="dxa"/>
+                    <w:end w:w="40" w:type="dxa"/>
+                  </w:tcMar>
+                  <w:shd w:fill="FFFFFF"/>
+                </w:tcPr>
+                <w:p>
+                  <w:pPr>
+                    <w:keepNext w:val="0"/>
+                    <w:spacing w:before="0" w:after="0" w:line="240" w:lineRule="auto"/>
+                    <w:jc w:val="center"/>
+                  </w:pPr>
+                  <w:r>
+                    <w:rPr>
+                      <w:rFonts w:ascii="Aptos" w:hAnsi="Aptos" w:eastAsia="Aptos"/>
+                      <w:b w:val="0"/>
+                      <w:i w:val="0"/>
+                      <w:color w:val="1F2937"/>
+                      <w:sz w:val="19"/>
+                    </w:rPr>
+                  </w:r>
+                </w:p>
+              </w:tc>
+              <w:tc>
+                <w:tcPr>
+                  <w:tcW w:type="dxa" w:w="539"/>
+                  <w:tcBorders>
+                    <w:top w:val="single" w:sz="7" w:space="0" w:color="9CA3AF"/>
+                    <w:left w:val="single" w:sz="7" w:space="0" w:color="9CA3AF"/>
+                    <w:bottom w:val="single" w:sz="7" w:space="0" w:color="9CA3AF"/>
+                    <w:right w:val="single" w:sz="7" w:space="0" w:color="9CA3AF"/>
+                    <w:insideH w:val="single" w:sz="7" w:space="0" w:color="9CA3AF"/>
+                    <w:insideV w:val="single" w:sz="7" w:space="0" w:color="9CA3AF"/>
+                  </w:tcBorders>
+                  <w:tcMar>
+                    <w:top w:w="110" w:type="dxa"/>
+                    <w:start w:w="40" w:type="dxa"/>
+                    <w:bottom w:w="110" w:type="dxa"/>
+                    <w:end w:w="40" w:type="dxa"/>
+                  </w:tcMar>
+                  <w:shd w:fill="FFFFFF"/>
+                </w:tcPr>
+                <w:p>
+                  <w:pPr>
+                    <w:keepNext w:val="0"/>
+                    <w:spacing w:before="0" w:after="0" w:line="240" w:lineRule="auto"/>
+                    <w:jc w:val="center"/>
+                  </w:pPr>
+                  <w:r>
+                    <w:rPr>
+                      <w:rFonts w:ascii="Aptos" w:hAnsi="Aptos" w:eastAsia="Aptos"/>
+                      <w:b w:val="0"/>
+                      <w:i w:val="0"/>
+                      <w:color w:val="1F2937"/>
+                      <w:sz w:val="19"/>
+                    </w:rPr>
+                  </w:r>
+                </w:p>
+              </w:tc>
+              <w:tc>
+                <w:tcPr>
+                  <w:tcW w:type="dxa" w:w="539"/>
+                  <w:tcBorders>
+                    <w:top w:val="single" w:sz="7" w:space="0" w:color="9CA3AF"/>
+                    <w:left w:val="single" w:sz="7" w:space="0" w:color="9CA3AF"/>
+                    <w:bottom w:val="single" w:sz="7" w:space="0" w:color="9CA3AF"/>
+                    <w:right w:val="single" w:sz="7" w:space="0" w:color="9CA3AF"/>
+                    <w:insideH w:val="single" w:sz="7" w:space="0" w:color="9CA3AF"/>
+                    <w:insideV w:val="single" w:sz="7" w:space="0" w:color="9CA3AF"/>
+                  </w:tcBorders>
+                  <w:tcMar>
+                    <w:top w:w="110" w:type="dxa"/>
+                    <w:start w:w="40" w:type="dxa"/>
+                    <w:bottom w:w="110" w:type="dxa"/>
+                    <w:end w:w="40" w:type="dxa"/>
+                  </w:tcMar>
+                  <w:shd w:fill="FFFFFF"/>
+                </w:tcPr>
+                <w:p>
+                  <w:pPr>
+                    <w:keepNext w:val="0"/>
+                    <w:spacing w:before="0" w:after="0" w:line="240" w:lineRule="auto"/>
+                    <w:jc w:val="center"/>
+                  </w:pPr>
+                  <w:r>
+                    <w:rPr>
+                      <w:rFonts w:ascii="Aptos" w:hAnsi="Aptos" w:eastAsia="Aptos"/>
+                      <w:b w:val="0"/>
+                      <w:i w:val="0"/>
+                      <w:color w:val="1F2937"/>
+                      <w:sz w:val="19"/>
+                    </w:rPr>
+                  </w:r>
+                </w:p>
+              </w:tc>
+              <w:tc>
+                <w:tcPr>
+                  <w:tcW w:type="dxa" w:w="539"/>
+                  <w:tcBorders>
+                    <w:top w:val="single" w:sz="7" w:space="0" w:color="9CA3AF"/>
+                    <w:left w:val="single" w:sz="7" w:space="0" w:color="9CA3AF"/>
+                    <w:bottom w:val="single" w:sz="7" w:space="0" w:color="9CA3AF"/>
+                    <w:right w:val="single" w:sz="7" w:space="0" w:color="9CA3AF"/>
+                    <w:insideH w:val="single" w:sz="7" w:space="0" w:color="9CA3AF"/>
+                    <w:insideV w:val="single" w:sz="7" w:space="0" w:color="9CA3AF"/>
+                  </w:tcBorders>
+                  <w:tcMar>
+                    <w:top w:w="110" w:type="dxa"/>
+                    <w:start w:w="40" w:type="dxa"/>
+                    <w:bottom w:w="110" w:type="dxa"/>
+                    <w:end w:w="40" w:type="dxa"/>
+                  </w:tcMar>
+                  <w:shd w:fill="FFFFFF"/>
+                </w:tcPr>
+                <w:p>
+                  <w:pPr>
+                    <w:keepNext w:val="0"/>
+                    <w:spacing w:before="0" w:after="0" w:line="240" w:lineRule="auto"/>
+                    <w:jc w:val="center"/>
+                  </w:pPr>
+                  <w:r>
+                    <w:rPr>
+                      <w:rFonts w:ascii="Aptos" w:hAnsi="Aptos" w:eastAsia="Aptos"/>
+                      <w:b w:val="0"/>
+                      <w:i w:val="0"/>
+                      <w:color w:val="1F2937"/>
+                      <w:sz w:val="19"/>
+                    </w:rPr>
+                  </w:r>
+                </w:p>
+              </w:tc>
+              <w:tc>
+                <w:tcPr>
+                  <w:tcW w:type="dxa" w:w="539"/>
+                  <w:tcBorders>
+                    <w:top w:val="single" w:sz="7" w:space="0" w:color="9CA3AF"/>
+                    <w:left w:val="single" w:sz="7" w:space="0" w:color="9CA3AF"/>
+                    <w:bottom w:val="single" w:sz="7" w:space="0" w:color="9CA3AF"/>
+                    <w:right w:val="single" w:sz="7" w:space="0" w:color="9CA3AF"/>
+                    <w:insideH w:val="single" w:sz="7" w:space="0" w:color="9CA3AF"/>
+                    <w:insideV w:val="single" w:sz="7" w:space="0" w:color="9CA3AF"/>
+                  </w:tcBorders>
+                  <w:tcMar>
+                    <w:top w:w="110" w:type="dxa"/>
+                    <w:start w:w="40" w:type="dxa"/>
+                    <w:bottom w:w="110" w:type="dxa"/>
+                    <w:end w:w="40" w:type="dxa"/>
+                  </w:tcMar>
+                  <w:shd w:fill="FFFFFF"/>
+                </w:tcPr>
+                <w:p>
+                  <w:pPr>
+                    <w:keepNext w:val="0"/>
+                    <w:spacing w:before="0" w:after="0" w:line="240" w:lineRule="auto"/>
+                    <w:jc w:val="center"/>
+                  </w:pPr>
+                  <w:r>
+                    <w:rPr>
+                      <w:rFonts w:ascii="Aptos" w:hAnsi="Aptos" w:eastAsia="Aptos"/>
+                      <w:b w:val="0"/>
+                      <w:i w:val="0"/>
+                      <w:color w:val="1F2937"/>
+                      <w:sz w:val="19"/>
+                    </w:rPr>
+                  </w:r>
+                </w:p>
+              </w:tc>
+              <w:tc>
+                <w:tcPr>
+                  <w:tcW w:type="dxa" w:w="539"/>
+                  <w:tcBorders>
+                    <w:top w:val="single" w:sz="7" w:space="0" w:color="9CA3AF"/>
+                    <w:left w:val="single" w:sz="7" w:space="0" w:color="9CA3AF"/>
+                    <w:bottom w:val="single" w:sz="7" w:space="0" w:color="9CA3AF"/>
+                    <w:right w:val="single" w:sz="7" w:space="0" w:color="9CA3AF"/>
+                    <w:insideH w:val="single" w:sz="7" w:space="0" w:color="9CA3AF"/>
+                    <w:insideV w:val="single" w:sz="7" w:space="0" w:color="9CA3AF"/>
+                  </w:tcBorders>
+                  <w:tcMar>
+                    <w:top w:w="110" w:type="dxa"/>
+                    <w:start w:w="40" w:type="dxa"/>
+                    <w:bottom w:w="110" w:type="dxa"/>
+                    <w:end w:w="40" w:type="dxa"/>
+                  </w:tcMar>
+                  <w:shd w:fill="FFFFFF"/>
+                </w:tcPr>
+                <w:p>
+                  <w:pPr>
+                    <w:keepNext w:val="0"/>
+                    <w:spacing w:before="0" w:after="0" w:line="240" w:lineRule="auto"/>
+                    <w:jc w:val="center"/>
+                  </w:pPr>
+                  <w:r>
+                    <w:rPr>
+                      <w:rFonts w:ascii="Aptos" w:hAnsi="Aptos" w:eastAsia="Aptos"/>
+                      <w:b w:val="0"/>
+                      <w:i w:val="0"/>
+                      <w:color w:val="1F2937"/>
+                      <w:sz w:val="19"/>
+                    </w:rPr>
+                  </w:r>
+                </w:p>
+              </w:tc>
+              <w:tc>
+                <w:tcPr>
+                  <w:tcW w:type="dxa" w:w="539"/>
+                  <w:tcBorders>
+                    <w:top w:val="single" w:sz="7" w:space="0" w:color="9CA3AF"/>
+                    <w:left w:val="single" w:sz="7" w:space="0" w:color="9CA3AF"/>
+                    <w:bottom w:val="single" w:sz="7" w:space="0" w:color="9CA3AF"/>
+                    <w:right w:val="single" w:sz="7" w:space="0" w:color="9CA3AF"/>
+                    <w:insideH w:val="single" w:sz="7" w:space="0" w:color="9CA3AF"/>
+                    <w:insideV w:val="single" w:sz="7" w:space="0" w:color="9CA3AF"/>
+                  </w:tcBorders>
+                  <w:tcMar>
+                    <w:top w:w="110" w:type="dxa"/>
+                    <w:start w:w="40" w:type="dxa"/>
+                    <w:bottom w:w="110" w:type="dxa"/>
+                    <w:end w:w="40" w:type="dxa"/>
+                  </w:tcMar>
+                  <w:shd w:fill="FFFFFF"/>
+                </w:tcPr>
+                <w:p>
+                  <w:pPr>
+                    <w:keepNext w:val="0"/>
+                    <w:spacing w:before="0" w:after="0" w:line="240" w:lineRule="auto"/>
+                    <w:jc w:val="center"/>
+                  </w:pPr>
+                  <w:r>
+                    <w:rPr>
+                      <w:rFonts w:ascii="Aptos" w:hAnsi="Aptos" w:eastAsia="Aptos"/>
+                      <w:b w:val="0"/>
+                      <w:i w:val="0"/>
+                      <w:color w:val="1F2937"/>
+                      <w:sz w:val="19"/>
+                    </w:rPr>
+                  </w:r>
+                </w:p>
+              </w:tc>
+              <w:tc>
+                <w:tcPr>
+                  <w:tcW w:type="dxa" w:w="539"/>
+                  <w:tcBorders>
+                    <w:top w:val="single" w:sz="7" w:space="0" w:color="9CA3AF"/>
+                    <w:left w:val="single" w:sz="7" w:space="0" w:color="9CA3AF"/>
+                    <w:bottom w:val="single" w:sz="7" w:space="0" w:color="9CA3AF"/>
+                    <w:right w:val="single" w:sz="7" w:space="0" w:color="9CA3AF"/>
+                    <w:insideH w:val="single" w:sz="7" w:space="0" w:color="9CA3AF"/>
+                    <w:insideV w:val="single" w:sz="7" w:space="0" w:color="9CA3AF"/>
+                  </w:tcBorders>
+                  <w:tcMar>
+                    <w:top w:w="110" w:type="dxa"/>
+                    <w:start w:w="40" w:type="dxa"/>
+                    <w:bottom w:w="110" w:type="dxa"/>
+                    <w:end w:w="40" w:type="dxa"/>
+                  </w:tcMar>
+                  <w:shd w:fill="FFFFFF"/>
+                </w:tcPr>
+                <w:p>
+                  <w:pPr>
+                    <w:keepNext w:val="0"/>
+                    <w:spacing w:before="0" w:after="0" w:line="240" w:lineRule="auto"/>
+                    <w:jc w:val="center"/>
+                  </w:pPr>
+                  <w:r>
+                    <w:rPr>
+                      <w:rFonts w:ascii="Aptos" w:hAnsi="Aptos" w:eastAsia="Aptos"/>
+                      <w:b w:val="0"/>
+                      <w:i w:val="0"/>
+                      <w:color w:val="1F2937"/>
+                      <w:sz w:val="19"/>
+                    </w:rPr>
+                  </w:r>
+                </w:p>
+              </w:tc>
+              <w:tc>
+                <w:tcPr>
+                  <w:tcW w:type="dxa" w:w="1077"/>
+                  <w:tcBorders>
+                    <w:top w:val="single" w:sz="7" w:space="0" w:color="9CA3AF"/>
+                    <w:left w:val="single" w:sz="7" w:space="0" w:color="9CA3AF"/>
+                    <w:bottom w:val="single" w:sz="7" w:space="0" w:color="9CA3AF"/>
+                    <w:right w:val="single" w:sz="7" w:space="0" w:color="9CA3AF"/>
+                    <w:insideH w:val="single" w:sz="7" w:space="0" w:color="9CA3AF"/>
+                    <w:insideV w:val="single" w:sz="7" w:space="0" w:color="9CA3AF"/>
+                  </w:tcBorders>
+                  <w:tcMar>
+                    <w:top w:w="110" w:type="dxa"/>
+                    <w:start w:w="40" w:type="dxa"/>
+                    <w:bottom w:w="110" w:type="dxa"/>
+                    <w:end w:w="40" w:type="dxa"/>
+                  </w:tcMar>
+                  <w:shd w:fill="FFFFFF"/>
+                </w:tcPr>
+                <w:p>
+                  <w:pPr>
+                    <w:keepNext w:val="0"/>
+                    <w:spacing w:before="0" w:after="0" w:line="240" w:lineRule="auto"/>
+                    <w:jc w:val="center"/>
+                  </w:pPr>
+                  <w:r>
+                    <w:rPr>
+                      <w:rFonts w:ascii="Aptos" w:hAnsi="Aptos" w:eastAsia="Aptos"/>
+                      <w:b/>
+                      <w:i w:val="0"/>
+                      <w:color w:val="1F2937"/>
+                      <w:sz w:val="19"/>
+                    </w:rPr>
+                    <w:t xml:space="preserve">    / 12</w:t>
+                  </w:r>
+                </w:p>
+              </w:tc>
+            </w:tr>
+          </w:tbl>
+          <w:p/>
+          <w:p>
+            <w:pPr>
+              <w:keepNext w:val="0"/>
+              <w:spacing w:before="80" w:after="80" w:line="252" w:lineRule="auto"/>
+            </w:pPr>
+            <w:r>
+              <w:rPr>
+                <w:rFonts w:ascii="Aptos" w:hAnsi="Aptos" w:eastAsia="Aptos"/>
+                <w:b w:val="0"/>
+                <w:i w:val="0"/>
+                <w:color w:val="1F2937"/>
+                <w:sz w:val="19"/>
+              </w:rPr>
+              <w:t xml:space="preserve">4-8 zadań = </w:t>
+            </w:r>
+            <w:r>
+              <w:rPr>
+                <w:rFonts w:ascii="Aptos" w:hAnsi="Aptos" w:eastAsia="Aptos"/>
+                <w:b/>
+                <w:i w:val="0"/>
+                <w:color w:val="1F2937"/>
+                <w:sz w:val="19"/>
+              </w:rPr>
+              <w:t>+</w:t>
+            </w:r>
+            <w:r>
+              <w:rPr>
+                <w:rFonts w:ascii="Aptos" w:hAnsi="Aptos" w:eastAsia="Aptos"/>
+                <w:b w:val="0"/>
+                <w:i w:val="0"/>
+                <w:color w:val="1F2937"/>
+                <w:sz w:val="19"/>
+              </w:rPr>
+              <w:t xml:space="preserve">     9-10 zadań = </w:t>
+            </w:r>
+            <w:r>
+              <w:rPr>
+                <w:rFonts w:ascii="Aptos" w:hAnsi="Aptos" w:eastAsia="Aptos"/>
+                <w:b/>
+                <w:i w:val="0"/>
+                <w:color w:val="1F2937"/>
+                <w:sz w:val="19"/>
+              </w:rPr>
+              <w:t>++</w:t>
+            </w:r>
+            <w:r>
+              <w:rPr>
+                <w:rFonts w:ascii="Aptos" w:hAnsi="Aptos" w:eastAsia="Aptos"/>
+                <w:b w:val="0"/>
+                <w:i w:val="0"/>
+                <w:color w:val="1F2937"/>
+                <w:sz w:val="19"/>
+              </w:rPr>
+              <w:t xml:space="preserve">     11-12 zadań = </w:t>
+            </w:r>
+            <w:r>
+              <w:rPr>
+                <w:rFonts w:ascii="Aptos" w:hAnsi="Aptos" w:eastAsia="Aptos"/>
+                <w:b/>
+                <w:i w:val="0"/>
+                <w:color w:val="1F2937"/>
+                <w:sz w:val="19"/>
+              </w:rPr>
+              <w:t>+++</w:t>
+            </w:r>
+            <w:r>
+              <w:rPr>
+                <w:rFonts w:ascii="Aptos" w:hAnsi="Aptos" w:eastAsia="Aptos"/>
+                <w:b w:val="0"/>
+                <w:i w:val="0"/>
+                <w:color w:val="1F2937"/>
+                <w:sz w:val="19"/>
+              </w:rPr>
+              <w:t xml:space="preserve">          Moje plusy: </w:t>
+            </w:r>
+            <w:r>
+              <w:rPr>
+                <w:rFonts w:ascii="Aptos" w:hAnsi="Aptos" w:eastAsia="Aptos"/>
+                <w:b w:val="0"/>
+                <w:i w:val="0"/>
+                <w:color w:val="9CA3AF"/>
+                <w:sz w:val="19"/>
+              </w:rPr>
+              <w:t>..............</w:t>
+            </w:r>
+          </w:p>
+          <w:p>
+            <w:pPr>
+              <w:keepNext w:val="0"/>
+              <w:spacing w:before="0" w:after="40" w:line="252" w:lineRule="auto"/>
+            </w:pPr>
+            <w:r>
+              <w:rPr>
+                <w:rFonts w:ascii="Aptos" w:hAnsi="Aptos" w:eastAsia="Aptos"/>
+                <w:b/>
+                <w:i w:val="0"/>
+                <w:color w:val="1F2937"/>
+                <w:sz w:val="20"/>
+              </w:rPr>
+              <w:t>2. Zamaluj numer zadania, które teraz rozumiem lepiej.</w:t>
+            </w:r>
+          </w:p>
+          <w:tbl>
+            <w:tblPr>
+              <w:tblW w:type="auto" w:w="0"/>
+              <w:tblLayout w:type="fixed"/>
+              <w:tblLook w:firstColumn="1" w:firstRow="1" w:lastColumn="0" w:lastRow="0" w:noHBand="0" w:noVBand="1" w:val="04A0"/>
+            </w:tblPr>
+            <w:tblGrid>
+              <w:gridCol w:w="831"/>
+              <w:gridCol w:w="831"/>
+              <w:gridCol w:w="831"/>
+              <w:gridCol w:w="831"/>
+              <w:gridCol w:w="831"/>
+              <w:gridCol w:w="831"/>
+              <w:gridCol w:w="831"/>
+              <w:gridCol w:w="831"/>
+              <w:gridCol w:w="831"/>
+              <w:gridCol w:w="831"/>
+              <w:gridCol w:w="831"/>
+              <w:gridCol w:w="831"/>
+            </w:tblGrid>
+            <w:tr>
+              <w:tc>
+                <w:tcPr>
+                  <w:tcW w:type="dxa" w:w="595"/>
+                  <w:tcBorders>
+                    <w:top w:val="single" w:sz="7" w:space="0" w:color="374151"/>
+                    <w:left w:val="single" w:sz="7" w:space="0" w:color="374151"/>
+                    <w:bottom w:val="single" w:sz="7" w:space="0" w:color="374151"/>
+                    <w:right w:val="single" w:sz="7" w:space="0" w:color="374151"/>
+                    <w:insideH w:val="single" w:sz="7" w:space="0" w:color="374151"/>
+                    <w:insideV w:val="single" w:sz="7" w:space="0" w:color="374151"/>
+                  </w:tcBorders>
+                  <w:shd w:fill="FFFFFF"/>
+                  <w:tcMar>
+                    <w:top w:w="90" w:type="dxa"/>
+                    <w:start w:w="40" w:type="dxa"/>
+                    <w:bottom w:w="90" w:type="dxa"/>
+                    <w:end w:w="40" w:type="dxa"/>
+                  </w:tcMar>
+                </w:tcPr>
+                <w:p>
+                  <w:pPr>
+                    <w:keepNext w:val="0"/>
+                    <w:spacing w:before="0" w:after="0" w:line="240" w:lineRule="auto"/>
+                    <w:jc w:val="center"/>
+                  </w:pPr>
+                  <w:r>
+                    <w:rPr>
+                      <w:rFonts w:ascii="Aptos" w:hAnsi="Aptos" w:eastAsia="Aptos"/>
+                      <w:b/>
+                      <w:i w:val="0"/>
+                      <w:color w:val="1F2937"/>
+                      <w:sz w:val="20"/>
+                    </w:rPr>
+                    <w:t>1</w:t>
+                  </w:r>
+                </w:p>
+              </w:tc>
+              <w:tc>
+                <w:tcPr>
+                  <w:tcW w:type="dxa" w:w="595"/>
+                  <w:tcBorders>
+                    <w:top w:val="single" w:sz="7" w:space="0" w:color="374151"/>
+                    <w:left w:val="single" w:sz="7" w:space="0" w:color="374151"/>
+                    <w:bottom w:val="single" w:sz="7" w:space="0" w:color="374151"/>
+                    <w:right w:val="single" w:sz="7" w:space="0" w:color="374151"/>
+                    <w:insideH w:val="single" w:sz="7" w:space="0" w:color="374151"/>
+                    <w:insideV w:val="single" w:sz="7" w:space="0" w:color="374151"/>
+                  </w:tcBorders>
+                  <w:shd w:fill="FFFFFF"/>
+                  <w:tcMar>
+                    <w:top w:w="90" w:type="dxa"/>
+                    <w:start w:w="40" w:type="dxa"/>
+                    <w:bottom w:w="90" w:type="dxa"/>
+                    <w:end w:w="40" w:type="dxa"/>
+                  </w:tcMar>
+                </w:tcPr>
+                <w:p>
+                  <w:pPr>
+                    <w:keepNext w:val="0"/>
+                    <w:spacing w:before="0" w:after="0" w:line="240" w:lineRule="auto"/>
+                    <w:jc w:val="center"/>
+                  </w:pPr>
+                  <w:r>
+                    <w:rPr>
+                      <w:rFonts w:ascii="Aptos" w:hAnsi="Aptos" w:eastAsia="Aptos"/>
+                      <w:b/>
+                      <w:i w:val="0"/>
+                      <w:color w:val="1F2937"/>
+                      <w:sz w:val="20"/>
+                    </w:rPr>
+                    <w:t>2</w:t>
+                  </w:r>
+                </w:p>
+              </w:tc>
+              <w:tc>
+                <w:tcPr>
+                  <w:tcW w:type="dxa" w:w="595"/>
+                  <w:tcBorders>
+                    <w:top w:val="single" w:sz="7" w:space="0" w:color="374151"/>
+                    <w:left w:val="single" w:sz="7" w:space="0" w:color="374151"/>
+                    <w:bottom w:val="single" w:sz="7" w:space="0" w:color="374151"/>
+                    <w:right w:val="single" w:sz="7" w:space="0" w:color="374151"/>
+                    <w:insideH w:val="single" w:sz="7" w:space="0" w:color="374151"/>
+                    <w:insideV w:val="single" w:sz="7" w:space="0" w:color="374151"/>
+                  </w:tcBorders>
+                  <w:shd w:fill="FFFFFF"/>
+                  <w:tcMar>
+                    <w:top w:w="90" w:type="dxa"/>
+                    <w:start w:w="40" w:type="dxa"/>
+                    <w:bottom w:w="90" w:type="dxa"/>
+                    <w:end w:w="40" w:type="dxa"/>
+                  </w:tcMar>
+                </w:tcPr>
+                <w:p>
+                  <w:pPr>
+                    <w:keepNext w:val="0"/>
+                    <w:spacing w:before="0" w:after="0" w:line="240" w:lineRule="auto"/>
+                    <w:jc w:val="center"/>
+                  </w:pPr>
+                  <w:r>
+                    <w:rPr>
+                      <w:rFonts w:ascii="Aptos" w:hAnsi="Aptos" w:eastAsia="Aptos"/>
+                      <w:b/>
+                      <w:i w:val="0"/>
+                      <w:color w:val="1F2937"/>
+                      <w:sz w:val="20"/>
+                    </w:rPr>
+                    <w:t>3</w:t>
+                  </w:r>
+                </w:p>
+              </w:tc>
+              <w:tc>
+                <w:tcPr>
+                  <w:tcW w:type="dxa" w:w="595"/>
+                  <w:tcBorders>
+                    <w:top w:val="single" w:sz="7" w:space="0" w:color="374151"/>
+                    <w:left w:val="single" w:sz="7" w:space="0" w:color="374151"/>
+                    <w:bottom w:val="single" w:sz="7" w:space="0" w:color="374151"/>
+                    <w:right w:val="single" w:sz="7" w:space="0" w:color="374151"/>
+                    <w:insideH w:val="single" w:sz="7" w:space="0" w:color="374151"/>
+                    <w:insideV w:val="single" w:sz="7" w:space="0" w:color="374151"/>
+                  </w:tcBorders>
+                  <w:shd w:fill="FFFFFF"/>
+                  <w:tcMar>
+                    <w:top w:w="90" w:type="dxa"/>
+                    <w:start w:w="40" w:type="dxa"/>
+                    <w:bottom w:w="90" w:type="dxa"/>
+                    <w:end w:w="40" w:type="dxa"/>
+                  </w:tcMar>
+                </w:tcPr>
+                <w:p>
+                  <w:pPr>
+                    <w:keepNext w:val="0"/>
+                    <w:spacing w:before="0" w:after="0" w:line="240" w:lineRule="auto"/>
+                    <w:jc w:val="center"/>
+                  </w:pPr>
+                  <w:r>
+                    <w:rPr>
+                      <w:rFonts w:ascii="Aptos" w:hAnsi="Aptos" w:eastAsia="Aptos"/>
+                      <w:b/>
+                      <w:i w:val="0"/>
+                      <w:color w:val="1F2937"/>
+                      <w:sz w:val="20"/>
+                    </w:rPr>
+                    <w:t>4</w:t>
+                  </w:r>
+                </w:p>
+              </w:tc>
+              <w:tc>
+                <w:tcPr>
+                  <w:tcW w:type="dxa" w:w="595"/>
+                  <w:tcBorders>
+                    <w:top w:val="single" w:sz="7" w:space="0" w:color="374151"/>
+                    <w:left w:val="single" w:sz="7" w:space="0" w:color="374151"/>
+                    <w:bottom w:val="single" w:sz="7" w:space="0" w:color="374151"/>
+                    <w:right w:val="single" w:sz="7" w:space="0" w:color="374151"/>
+                    <w:insideH w:val="single" w:sz="7" w:space="0" w:color="374151"/>
+                    <w:insideV w:val="single" w:sz="7" w:space="0" w:color="374151"/>
+                  </w:tcBorders>
+                  <w:shd w:fill="FFFFFF"/>
+                  <w:tcMar>
+                    <w:top w:w="90" w:type="dxa"/>
+                    <w:start w:w="40" w:type="dxa"/>
+                    <w:bottom w:w="90" w:type="dxa"/>
+                    <w:end w:w="40" w:type="dxa"/>
+                  </w:tcMar>
+                </w:tcPr>
+                <w:p>
+                  <w:pPr>
+                    <w:keepNext w:val="0"/>
+                    <w:spacing w:before="0" w:after="0" w:line="240" w:lineRule="auto"/>
+                    <w:jc w:val="center"/>
+                  </w:pPr>
+                  <w:r>
+                    <w:rPr>
+                      <w:rFonts w:ascii="Aptos" w:hAnsi="Aptos" w:eastAsia="Aptos"/>
+                      <w:b/>
+                      <w:i w:val="0"/>
+                      <w:color w:val="1F2937"/>
+                      <w:sz w:val="20"/>
+                    </w:rPr>
+                    <w:t>5</w:t>
+                  </w:r>
+                </w:p>
+              </w:tc>
+              <w:tc>
+                <w:tcPr>
+                  <w:tcW w:type="dxa" w:w="595"/>
+                  <w:tcBorders>
+                    <w:top w:val="single" w:sz="7" w:space="0" w:color="374151"/>
+                    <w:left w:val="single" w:sz="7" w:space="0" w:color="374151"/>
+                    <w:bottom w:val="single" w:sz="7" w:space="0" w:color="374151"/>
+                    <w:right w:val="single" w:sz="7" w:space="0" w:color="374151"/>
+                    <w:insideH w:val="single" w:sz="7" w:space="0" w:color="374151"/>
+                    <w:insideV w:val="single" w:sz="7" w:space="0" w:color="374151"/>
+                  </w:tcBorders>
+                  <w:shd w:fill="FFFFFF"/>
+                  <w:tcMar>
+                    <w:top w:w="90" w:type="dxa"/>
+                    <w:start w:w="40" w:type="dxa"/>
+                    <w:bottom w:w="90" w:type="dxa"/>
+                    <w:end w:w="40" w:type="dxa"/>
+                  </w:tcMar>
+                </w:tcPr>
+                <w:p>
+                  <w:pPr>
+                    <w:keepNext w:val="0"/>
+                    <w:spacing w:before="0" w:after="0" w:line="240" w:lineRule="auto"/>
+                    <w:jc w:val="center"/>
+                  </w:pPr>
+                  <w:r>
+                    <w:rPr>
+                      <w:rFonts w:ascii="Aptos" w:hAnsi="Aptos" w:eastAsia="Aptos"/>
+                      <w:b/>
+                      <w:i w:val="0"/>
+                      <w:color w:val="1F2937"/>
+                      <w:sz w:val="20"/>
+                    </w:rPr>
+                    <w:t>6</w:t>
+                  </w:r>
+                </w:p>
+              </w:tc>
+              <w:tc>
+                <w:tcPr>
+                  <w:tcW w:type="dxa" w:w="595"/>
+                  <w:tcBorders>
+                    <w:top w:val="single" w:sz="7" w:space="0" w:color="374151"/>
+                    <w:left w:val="single" w:sz="7" w:space="0" w:color="374151"/>
+                    <w:bottom w:val="single" w:sz="7" w:space="0" w:color="374151"/>
+                    <w:right w:val="single" w:sz="7" w:space="0" w:color="374151"/>
+                    <w:insideH w:val="single" w:sz="7" w:space="0" w:color="374151"/>
+                    <w:insideV w:val="single" w:sz="7" w:space="0" w:color="374151"/>
+                  </w:tcBorders>
+                  <w:shd w:fill="FFFFFF"/>
+                  <w:tcMar>
+                    <w:top w:w="90" w:type="dxa"/>
+                    <w:start w:w="40" w:type="dxa"/>
+                    <w:bottom w:w="90" w:type="dxa"/>
+                    <w:end w:w="40" w:type="dxa"/>
+                  </w:tcMar>
+                </w:tcPr>
+                <w:p>
+                  <w:pPr>
+                    <w:keepNext w:val="0"/>
+                    <w:spacing w:before="0" w:after="0" w:line="240" w:lineRule="auto"/>
+                    <w:jc w:val="center"/>
+                  </w:pPr>
+                  <w:r>
+                    <w:rPr>
+                      <w:rFonts w:ascii="Aptos" w:hAnsi="Aptos" w:eastAsia="Aptos"/>
+                      <w:b/>
+                      <w:i w:val="0"/>
+                      <w:color w:val="1F2937"/>
+                      <w:sz w:val="20"/>
+                    </w:rPr>
+                    <w:t>7</w:t>
+                  </w:r>
+                </w:p>
+              </w:tc>
+              <w:tc>
+                <w:tcPr>
+                  <w:tcW w:type="dxa" w:w="595"/>
+                  <w:tcBorders>
+                    <w:top w:val="single" w:sz="7" w:space="0" w:color="374151"/>
+                    <w:left w:val="single" w:sz="7" w:space="0" w:color="374151"/>
+                    <w:bottom w:val="single" w:sz="7" w:space="0" w:color="374151"/>
+                    <w:right w:val="single" w:sz="7" w:space="0" w:color="374151"/>
+                    <w:insideH w:val="single" w:sz="7" w:space="0" w:color="374151"/>
+                    <w:insideV w:val="single" w:sz="7" w:space="0" w:color="374151"/>
+                  </w:tcBorders>
+                  <w:shd w:fill="FFFFFF"/>
+                  <w:tcMar>
+                    <w:top w:w="90" w:type="dxa"/>
+                    <w:start w:w="40" w:type="dxa"/>
+                    <w:bottom w:w="90" w:type="dxa"/>
+                    <w:end w:w="40" w:type="dxa"/>
+                  </w:tcMar>
+                </w:tcPr>
+                <w:p>
+                  <w:pPr>
+                    <w:keepNext w:val="0"/>
+                    <w:spacing w:before="0" w:after="0" w:line="240" w:lineRule="auto"/>
+                    <w:jc w:val="center"/>
+                  </w:pPr>
+                  <w:r>
+                    <w:rPr>
+                      <w:rFonts w:ascii="Aptos" w:hAnsi="Aptos" w:eastAsia="Aptos"/>
+                      <w:b/>
+                      <w:i w:val="0"/>
+                      <w:color w:val="1F2937"/>
+                      <w:sz w:val="20"/>
+                    </w:rPr>
+                    <w:t>8</w:t>
+                  </w:r>
+                </w:p>
+              </w:tc>
+              <w:tc>
+                <w:tcPr>
+                  <w:tcW w:type="dxa" w:w="595"/>
+                  <w:tcBorders>
+                    <w:top w:val="single" w:sz="7" w:space="0" w:color="374151"/>
+                    <w:left w:val="single" w:sz="7" w:space="0" w:color="374151"/>
+                    <w:bottom w:val="single" w:sz="7" w:space="0" w:color="374151"/>
+                    <w:right w:val="single" w:sz="7" w:space="0" w:color="374151"/>
+                    <w:insideH w:val="single" w:sz="7" w:space="0" w:color="374151"/>
+                    <w:insideV w:val="single" w:sz="7" w:space="0" w:color="374151"/>
+                  </w:tcBorders>
+                  <w:shd w:fill="FFFFFF"/>
+                  <w:tcMar>
+                    <w:top w:w="90" w:type="dxa"/>
+                    <w:start w:w="40" w:type="dxa"/>
+                    <w:bottom w:w="90" w:type="dxa"/>
+                    <w:end w:w="40" w:type="dxa"/>
+                  </w:tcMar>
+                </w:tcPr>
+                <w:p>
+                  <w:pPr>
+                    <w:keepNext w:val="0"/>
+                    <w:spacing w:before="0" w:after="0" w:line="240" w:lineRule="auto"/>
+                    <w:jc w:val="center"/>
+                  </w:pPr>
+                  <w:r>
+                    <w:rPr>
+                      <w:rFonts w:ascii="Aptos" w:hAnsi="Aptos" w:eastAsia="Aptos"/>
+                      <w:b/>
+                      <w:i w:val="0"/>
+                      <w:color w:val="1F2937"/>
+                      <w:sz w:val="20"/>
+                    </w:rPr>
+                    <w:t>9</w:t>
+                  </w:r>
+                </w:p>
+              </w:tc>
+              <w:tc>
+                <w:tcPr>
+                  <w:tcW w:type="dxa" w:w="595"/>
+                  <w:tcBorders>
+                    <w:top w:val="single" w:sz="7" w:space="0" w:color="374151"/>
+                    <w:left w:val="single" w:sz="7" w:space="0" w:color="374151"/>
+                    <w:bottom w:val="single" w:sz="7" w:space="0" w:color="374151"/>
+                    <w:right w:val="single" w:sz="7" w:space="0" w:color="374151"/>
+                    <w:insideH w:val="single" w:sz="7" w:space="0" w:color="374151"/>
+                    <w:insideV w:val="single" w:sz="7" w:space="0" w:color="374151"/>
+                  </w:tcBorders>
+                  <w:shd w:fill="FFFFFF"/>
+                  <w:tcMar>
+                    <w:top w:w="90" w:type="dxa"/>
+                    <w:start w:w="40" w:type="dxa"/>
+                    <w:bottom w:w="90" w:type="dxa"/>
+                    <w:end w:w="40" w:type="dxa"/>
+                  </w:tcMar>
+                </w:tcPr>
+                <w:p>
+                  <w:pPr>
+                    <w:keepNext w:val="0"/>
+                    <w:spacing w:before="0" w:after="0" w:line="240" w:lineRule="auto"/>
+                    <w:jc w:val="center"/>
+                  </w:pPr>
+                  <w:r>
+                    <w:rPr>
+                      <w:rFonts w:ascii="Aptos" w:hAnsi="Aptos" w:eastAsia="Aptos"/>
+                      <w:b/>
+                      <w:i w:val="0"/>
+                      <w:color w:val="1F2937"/>
+                      <w:sz w:val="20"/>
+                    </w:rPr>
+                    <w:t>10</w:t>
+                  </w:r>
+                </w:p>
+              </w:tc>
+              <w:tc>
+                <w:tcPr>
+                  <w:tcW w:type="dxa" w:w="595"/>
+                  <w:tcBorders>
+                    <w:top w:val="single" w:sz="7" w:space="0" w:color="374151"/>
+                    <w:left w:val="single" w:sz="7" w:space="0" w:color="374151"/>
+                    <w:bottom w:val="single" w:sz="7" w:space="0" w:color="374151"/>
+                    <w:right w:val="single" w:sz="7" w:space="0" w:color="374151"/>
+                    <w:insideH w:val="single" w:sz="7" w:space="0" w:color="374151"/>
+                    <w:insideV w:val="single" w:sz="7" w:space="0" w:color="374151"/>
+                  </w:tcBorders>
+                  <w:shd w:fill="FFFFFF"/>
+                  <w:tcMar>
+                    <w:top w:w="90" w:type="dxa"/>
+                    <w:start w:w="40" w:type="dxa"/>
+                    <w:bottom w:w="90" w:type="dxa"/>
+                    <w:end w:w="40" w:type="dxa"/>
+                  </w:tcMar>
+                </w:tcPr>
+                <w:p>
+                  <w:pPr>
+                    <w:keepNext w:val="0"/>
+                    <w:spacing w:before="0" w:after="0" w:line="240" w:lineRule="auto"/>
+                    <w:jc w:val="center"/>
+                  </w:pPr>
+                  <w:r>
+                    <w:rPr>
+                      <w:rFonts w:ascii="Aptos" w:hAnsi="Aptos" w:eastAsia="Aptos"/>
+                      <w:b/>
+                      <w:i w:val="0"/>
+                      <w:color w:val="1F2937"/>
+                      <w:sz w:val="20"/>
+                    </w:rPr>
+                    <w:t>11</w:t>
+                  </w:r>
+                </w:p>
+              </w:tc>
+              <w:tc>
+                <w:tcPr>
+                  <w:tcW w:type="dxa" w:w="595"/>
+                  <w:tcBorders>
+                    <w:top w:val="single" w:sz="7" w:space="0" w:color="374151"/>
+                    <w:left w:val="single" w:sz="7" w:space="0" w:color="374151"/>
+                    <w:bottom w:val="single" w:sz="7" w:space="0" w:color="374151"/>
+                    <w:right w:val="single" w:sz="7" w:space="0" w:color="374151"/>
+                    <w:insideH w:val="single" w:sz="7" w:space="0" w:color="374151"/>
+                    <w:insideV w:val="single" w:sz="7" w:space="0" w:color="374151"/>
+                  </w:tcBorders>
+                  <w:shd w:fill="FFFFFF"/>
+                  <w:tcMar>
+                    <w:top w:w="90" w:type="dxa"/>
+                    <w:start w:w="40" w:type="dxa"/>
+                    <w:bottom w:w="90" w:type="dxa"/>
+                    <w:end w:w="40" w:type="dxa"/>
+                  </w:tcMar>
+                </w:tcPr>
+                <w:p>
+                  <w:pPr>
+                    <w:keepNext w:val="0"/>
+                    <w:spacing w:before="0" w:after="0" w:line="240" w:lineRule="auto"/>
+                    <w:jc w:val="center"/>
+                  </w:pPr>
+                  <w:r>
+                    <w:rPr>
+                      <w:rFonts w:ascii="Aptos" w:hAnsi="Aptos" w:eastAsia="Aptos"/>
+                      <w:b/>
+                      <w:i w:val="0"/>
+                      <w:color w:val="1F2937"/>
+                      <w:sz w:val="20"/>
+                    </w:rPr>
+                    <w:t>12</w:t>
+                  </w:r>
+                </w:p>
+              </w:tc>
+            </w:tr>
+          </w:tbl>
+          <w:p/>
+          <w:p>
+            <w:pPr>
+              <w:spacing w:after="0"/>
+            </w:pPr>
+          </w:p>
+        </w:tc>
+      </w:tr>
+    </w:tbl>
     <w:sectPr>
       <w:footerReference w:type="default" r:id="rId9"/>
       <w:pgSz w:w="11906" w:h="16838"/>

</xml_diff>

<commit_message>
Arkusze wyrownawcze: + / - przy kazdym zadaniu do samodzielnego sprawdzenia
Uczen sam zakresla + albo - przy zadaniu i wpisuje sume plusow
(4-8 +, 9-10 ++, 11-12 +++). Tabela plusow w ramce wyleciala.
Dwie luki z kropkami rozbite na linie, zeby sie nie zawijaly.

Co-Authored-By: Claude Opus 5.5 <noreply@anthropic.com>
</commit_message>
<xml_diff>
--- a/public/materialy/wyrownawcze/arkusz-1-kiermasz-dobrych-pomyslow.docx
+++ b/public/materialy/wyrownawcze/arkusz-1-kiermasz-dobrych-pomyslow.docx
@@ -308,6 +308,9 @@
     <w:p>
       <w:pPr>
         <w:keepNext w:val="0"/>
+        <w:tabs>
+          <w:tab w:pos="10148" w:val="right"/>
+        </w:tabs>
         <w:spacing w:before="0" w:after="40" w:line="247" w:lineRule="auto"/>
       </w:pPr>
       <w:r>
@@ -330,6 +333,17 @@
         </w:rPr>
         <w:t>Po co klasa przygotowała stoisko?</w:t>
       </w:r>
+      <w:r>
+        <w:rPr>
+          <w:rFonts w:ascii="Aptos" w:hAnsi="Aptos" w:eastAsia="Aptos"/>
+          <w:b/>
+          <w:i w:val="0"/>
+          <w:color w:val="6B7280"/>
+          <w:sz w:val="20"/>
+        </w:rPr>
+        <w:tab/>
+        <w:t>( + )  ( − )</w:t>
+      </w:r>
     </w:p>
     <w:p>
       <w:pPr>
@@ -350,6 +364,9 @@
     <w:p>
       <w:pPr>
         <w:keepNext/>
+        <w:tabs>
+          <w:tab w:pos="10148" w:val="right"/>
+        </w:tabs>
         <w:spacing w:before="0" w:after="40" w:line="247" w:lineRule="auto"/>
       </w:pPr>
       <w:r>
@@ -371,6 +388,17 @@
           <w:sz w:val="20"/>
         </w:rPr>
         <w:t>Kto przygotował karteczki z cenami?</w:t>
+      </w:r>
+      <w:r>
+        <w:rPr>
+          <w:rFonts w:ascii="Aptos" w:hAnsi="Aptos" w:eastAsia="Aptos"/>
+          <w:b/>
+          <w:i w:val="0"/>
+          <w:color w:val="6B7280"/>
+          <w:sz w:val="20"/>
+        </w:rPr>
+        <w:tab/>
+        <w:t>( + )  ( − )</w:t>
       </w:r>
     </w:p>
     <w:p>
@@ -457,6 +485,9 @@
     <w:p>
       <w:pPr>
         <w:keepNext w:val="0"/>
+        <w:tabs>
+          <w:tab w:pos="10148" w:val="right"/>
+        </w:tabs>
         <w:spacing w:before="0" w:after="40" w:line="247" w:lineRule="auto"/>
       </w:pPr>
       <w:r>
@@ -478,6 +509,17 @@
           <w:sz w:val="20"/>
         </w:rPr>
         <w:t>Ponumeruj wydarzenia od 1 do 4.</w:t>
+      </w:r>
+      <w:r>
+        <w:rPr>
+          <w:rFonts w:ascii="Aptos" w:hAnsi="Aptos" w:eastAsia="Aptos"/>
+          <w:b/>
+          <w:i w:val="0"/>
+          <w:color w:val="6B7280"/>
+          <w:sz w:val="20"/>
+        </w:rPr>
+        <w:tab/>
+        <w:t>( + )  ( − )</w:t>
       </w:r>
     </w:p>
     <w:p>
@@ -501,6 +543,9 @@
     <w:p>
       <w:pPr>
         <w:keepNext w:val="0"/>
+        <w:tabs>
+          <w:tab w:pos="10148" w:val="right"/>
+        </w:tabs>
         <w:spacing w:before="0" w:after="40" w:line="247" w:lineRule="auto"/>
       </w:pPr>
       <w:r>
@@ -523,6 +568,17 @@
         </w:rPr>
         <w:t>Dlaczego najmniejsze rzeczy ustawiono z przodu? Odpowiedz pełnym zdaniem.</w:t>
       </w:r>
+      <w:r>
+        <w:rPr>
+          <w:rFonts w:ascii="Aptos" w:hAnsi="Aptos" w:eastAsia="Aptos"/>
+          <w:b/>
+          <w:i w:val="0"/>
+          <w:color w:val="6B7280"/>
+          <w:sz w:val="20"/>
+        </w:rPr>
+        <w:tab/>
+        <w:t>( + )  ( − )</w:t>
+      </w:r>
     </w:p>
     <w:p>
       <w:pPr>
@@ -543,6 +599,9 @@
     <w:p>
       <w:pPr>
         <w:keepNext/>
+        <w:tabs>
+          <w:tab w:pos="10148" w:val="right"/>
+        </w:tabs>
         <w:spacing w:before="0" w:after="40" w:line="247" w:lineRule="auto"/>
       </w:pPr>
       <w:r>
@@ -564,6 +623,17 @@
           <w:sz w:val="20"/>
         </w:rPr>
         <w:t>Które zdanie najlepiej mówi, czego uczy ta historia?</w:t>
+      </w:r>
+      <w:r>
+        <w:rPr>
+          <w:rFonts w:ascii="Aptos" w:hAnsi="Aptos" w:eastAsia="Aptos"/>
+          <w:b/>
+          <w:i w:val="0"/>
+          <w:color w:val="6B7280"/>
+          <w:sz w:val="20"/>
+        </w:rPr>
+        <w:tab/>
+        <w:t>( + )  ( − )</w:t>
       </w:r>
     </w:p>
     <w:p>
@@ -650,6 +720,9 @@
     <w:p>
       <w:pPr>
         <w:keepNext w:val="0"/>
+        <w:tabs>
+          <w:tab w:pos="10148" w:val="right"/>
+        </w:tabs>
         <w:spacing w:before="0" w:after="40" w:line="247" w:lineRule="auto"/>
       </w:pPr>
       <w:r>
@@ -671,6 +744,17 @@
           <w:sz w:val="20"/>
         </w:rPr>
         <w:t>Znajdź w tekście słowo, które znaczy prawie to samo co przedmioty niewielkiej wartości.</w:t>
+      </w:r>
+      <w:r>
+        <w:rPr>
+          <w:rFonts w:ascii="Aptos" w:hAnsi="Aptos" w:eastAsia="Aptos"/>
+          <w:b/>
+          <w:i w:val="0"/>
+          <w:color w:val="6B7280"/>
+          <w:sz w:val="20"/>
+        </w:rPr>
+        <w:tab/>
+        <w:t>( + )  ( − )</w:t>
       </w:r>
     </w:p>
     <w:p>
@@ -728,6 +812,9 @@
     <w:p>
       <w:pPr>
         <w:keepNext w:val="0"/>
+        <w:tabs>
+          <w:tab w:pos="10148" w:val="right"/>
+        </w:tabs>
         <w:spacing w:before="40" w:after="40" w:line="247" w:lineRule="auto"/>
       </w:pPr>
       <w:r>
@@ -750,6 +837,17 @@
         </w:rPr>
         <w:t>Wypisz z pierwszego akapitu trzy rzeczowniki.</w:t>
       </w:r>
+      <w:r>
+        <w:rPr>
+          <w:rFonts w:ascii="Aptos" w:hAnsi="Aptos" w:eastAsia="Aptos"/>
+          <w:b/>
+          <w:i w:val="0"/>
+          <w:color w:val="6B7280"/>
+          <w:sz w:val="20"/>
+        </w:rPr>
+        <w:tab/>
+        <w:t>( + )  ( − )</w:t>
+      </w:r>
     </w:p>
     <w:p>
       <w:pPr>
@@ -770,6 +868,9 @@
     <w:p>
       <w:pPr>
         <w:keepNext w:val="0"/>
+        <w:tabs>
+          <w:tab w:pos="10148" w:val="right"/>
+        </w:tabs>
         <w:spacing w:before="40" w:after="40" w:line="247" w:lineRule="auto"/>
       </w:pPr>
       <w:r>
@@ -792,10 +893,24 @@
         </w:rPr>
         <w:t>Uzupełnij zdanie właściwą formą wyrazu książka: Uczniowie zebrali pieniądze na nowe ....................... do biblioteki.</w:t>
       </w:r>
+      <w:r>
+        <w:rPr>
+          <w:rFonts w:ascii="Aptos" w:hAnsi="Aptos" w:eastAsia="Aptos"/>
+          <w:b/>
+          <w:i w:val="0"/>
+          <w:color w:val="6B7280"/>
+          <w:sz w:val="20"/>
+        </w:rPr>
+        <w:tab/>
+        <w:t>( + )  ( − )</w:t>
+      </w:r>
     </w:p>
     <w:p>
       <w:pPr>
         <w:keepNext w:val="0"/>
+        <w:tabs>
+          <w:tab w:pos="10148" w:val="right"/>
+        </w:tabs>
         <w:spacing w:before="40" w:after="40" w:line="247" w:lineRule="auto"/>
       </w:pPr>
       <w:r>
@@ -818,6 +933,17 @@
         </w:rPr>
         <w:t>Ułóż wyrazy w kolejności alfabetycznej: stoisko, zakładka, obrus, figurka.</w:t>
       </w:r>
+      <w:r>
+        <w:rPr>
+          <w:rFonts w:ascii="Aptos" w:hAnsi="Aptos" w:eastAsia="Aptos"/>
+          <w:b/>
+          <w:i w:val="0"/>
+          <w:color w:val="6B7280"/>
+          <w:sz w:val="20"/>
+        </w:rPr>
+        <w:tab/>
+        <w:t>( + )  ( − )</w:t>
+      </w:r>
     </w:p>
     <w:p>
       <w:pPr>
@@ -838,6 +964,9 @@
     <w:p>
       <w:pPr>
         <w:keepNext w:val="0"/>
+        <w:tabs>
+          <w:tab w:pos="10148" w:val="right"/>
+        </w:tabs>
         <w:spacing w:before="40" w:after="40" w:line="247" w:lineRule="auto"/>
       </w:pPr>
       <w:r>
@@ -860,6 +989,17 @@
         </w:rPr>
         <w:t>Połącz dwa zdania wyrazem ponieważ: Uczniowie byli dumni. Wspólnie rozwiązali problem.</w:t>
       </w:r>
+      <w:r>
+        <w:rPr>
+          <w:rFonts w:ascii="Aptos" w:hAnsi="Aptos" w:eastAsia="Aptos"/>
+          <w:b/>
+          <w:i w:val="0"/>
+          <w:color w:val="6B7280"/>
+          <w:sz w:val="20"/>
+        </w:rPr>
+        <w:tab/>
+        <w:t>( + )  ( − )</w:t>
+      </w:r>
     </w:p>
     <w:p>
       <w:pPr>
@@ -880,6 +1020,9 @@
     <w:p>
       <w:pPr>
         <w:keepNext w:val="0"/>
+        <w:tabs>
+          <w:tab w:pos="10148" w:val="right"/>
+        </w:tabs>
         <w:spacing w:before="40" w:after="40" w:line="247" w:lineRule="auto"/>
       </w:pPr>
       <w:r>
@@ -901,6 +1044,17 @@
           <w:sz w:val="20"/>
         </w:rPr>
         <w:t>Popraw zdanie. Zapisz wielką literę i potrzebny znak na końcu: czy sara przygotowała ceny</w:t>
+      </w:r>
+      <w:r>
+        <w:rPr>
+          <w:rFonts w:ascii="Aptos" w:hAnsi="Aptos" w:eastAsia="Aptos"/>
+          <w:b/>
+          <w:i w:val="0"/>
+          <w:color w:val="6B7280"/>
+          <w:sz w:val="20"/>
+        </w:rPr>
+        <w:tab/>
+        <w:t>( + )  ( − )</w:t>
       </w:r>
     </w:p>
     <w:p>
@@ -937,6 +1091,9 @@
     <w:p>
       <w:pPr>
         <w:keepNext w:val="0"/>
+        <w:tabs>
+          <w:tab w:pos="10148" w:val="right"/>
+        </w:tabs>
         <w:spacing w:before="0" w:after="40" w:line="252" w:lineRule="auto"/>
       </w:pPr>
       <w:r>
@@ -958,6 +1115,17 @@
           <w:sz w:val="20"/>
         </w:rPr>
         <w:t>Napisz krótką wiadomość do kolegi lub koleżanki. Zaproś tę osobę na szkolny kiermasz. Podaj miejsce, dzień i jedną zachętę.</w:t>
+      </w:r>
+      <w:r>
+        <w:rPr>
+          <w:rFonts w:ascii="Aptos" w:hAnsi="Aptos" w:eastAsia="Aptos"/>
+          <w:b/>
+          <w:i w:val="0"/>
+          <w:color w:val="6B7280"/>
+          <w:sz w:val="20"/>
+        </w:rPr>
+        <w:tab/>
+        <w:t>( + )  ( − )</w:t>
       </w:r>
     </w:p>
     <w:p>
@@ -1156,7 +1324,7 @@
                 <w:color w:val="1F2937"/>
                 <w:sz w:val="20"/>
               </w:rPr>
-              <w:t xml:space="preserve">1. Policz plusy. </w:t>
+              <w:t xml:space="preserve">1. Policz swoje plusy. </w:t>
             </w:r>
             <w:r>
               <w:rPr>
@@ -1166,1065 +1334,13 @@
                 <w:color w:val="1F2937"/>
                 <w:sz w:val="20"/>
               </w:rPr>
-              <w:t>Przy sprawdzaniu postaw + pod numerem każdego dobrze zrobionego zadania.</w:t>
+              <w:t>Przy sprawdzaniu zakreśl obok każdego zadania + (dobrze) albo − (do poprawy). Policz plusy i wpisz wynik.</w:t>
             </w:r>
           </w:p>
-          <w:tbl>
-            <w:tblPr>
-              <w:tblW w:type="auto" w:w="0"/>
-              <w:tblLayout w:type="fixed"/>
-              <w:tblLook w:firstColumn="1" w:firstRow="1" w:lastColumn="0" w:lastRow="0" w:noHBand="0" w:noVBand="1" w:val="04A0"/>
-            </w:tblPr>
-            <w:tblGrid>
-              <w:gridCol w:w="713"/>
-              <w:gridCol w:w="713"/>
-              <w:gridCol w:w="713"/>
-              <w:gridCol w:w="713"/>
-              <w:gridCol w:w="713"/>
-              <w:gridCol w:w="713"/>
-              <w:gridCol w:w="713"/>
-              <w:gridCol w:w="713"/>
-              <w:gridCol w:w="713"/>
-              <w:gridCol w:w="713"/>
-              <w:gridCol w:w="713"/>
-              <w:gridCol w:w="713"/>
-              <w:gridCol w:w="713"/>
-              <w:gridCol w:w="713"/>
-            </w:tblGrid>
-            <w:tr>
-              <w:tc>
-                <w:tcPr>
-                  <w:tcW w:type="dxa" w:w="964"/>
-                  <w:tcBorders>
-                    <w:top w:val="single" w:sz="7" w:space="0" w:color="9CA3AF"/>
-                    <w:left w:val="single" w:sz="7" w:space="0" w:color="9CA3AF"/>
-                    <w:bottom w:val="single" w:sz="7" w:space="0" w:color="9CA3AF"/>
-                    <w:right w:val="single" w:sz="7" w:space="0" w:color="9CA3AF"/>
-                    <w:insideH w:val="single" w:sz="7" w:space="0" w:color="9CA3AF"/>
-                    <w:insideV w:val="single" w:sz="7" w:space="0" w:color="9CA3AF"/>
-                  </w:tcBorders>
-                  <w:tcMar>
-                    <w:top w:w="40" w:type="dxa"/>
-                    <w:start w:w="40" w:type="dxa"/>
-                    <w:bottom w:w="40" w:type="dxa"/>
-                    <w:end w:w="40" w:type="dxa"/>
-                  </w:tcMar>
-                  <w:shd w:fill="EAF3F8"/>
-                </w:tcPr>
-                <w:p>
-                  <w:pPr>
-                    <w:keepNext w:val="0"/>
-                    <w:spacing w:before="0" w:after="0" w:line="240" w:lineRule="auto"/>
-                    <w:jc w:val="center"/>
-                  </w:pPr>
-                  <w:r>
-                    <w:rPr>
-                      <w:rFonts w:ascii="Aptos" w:hAnsi="Aptos" w:eastAsia="Aptos"/>
-                      <w:b w:val="0"/>
-                      <w:i w:val="0"/>
-                      <w:color w:val="1F2937"/>
-                      <w:sz w:val="19"/>
-                    </w:rPr>
-                    <w:t>zadanie</w:t>
-                  </w:r>
-                </w:p>
-              </w:tc>
-              <w:tc>
-                <w:tcPr>
-                  <w:tcW w:type="dxa" w:w="539"/>
-                  <w:tcBorders>
-                    <w:top w:val="single" w:sz="7" w:space="0" w:color="9CA3AF"/>
-                    <w:left w:val="single" w:sz="7" w:space="0" w:color="9CA3AF"/>
-                    <w:bottom w:val="single" w:sz="7" w:space="0" w:color="9CA3AF"/>
-                    <w:right w:val="single" w:sz="7" w:space="0" w:color="9CA3AF"/>
-                    <w:insideH w:val="single" w:sz="7" w:space="0" w:color="9CA3AF"/>
-                    <w:insideV w:val="single" w:sz="7" w:space="0" w:color="9CA3AF"/>
-                  </w:tcBorders>
-                  <w:tcMar>
-                    <w:top w:w="40" w:type="dxa"/>
-                    <w:start w:w="40" w:type="dxa"/>
-                    <w:bottom w:w="40" w:type="dxa"/>
-                    <w:end w:w="40" w:type="dxa"/>
-                  </w:tcMar>
-                  <w:shd w:fill="FFFFFF"/>
-                </w:tcPr>
-                <w:p>
-                  <w:pPr>
-                    <w:keepNext w:val="0"/>
-                    <w:spacing w:before="0" w:after="0" w:line="240" w:lineRule="auto"/>
-                    <w:jc w:val="center"/>
-                  </w:pPr>
-                  <w:r>
-                    <w:rPr>
-                      <w:rFonts w:ascii="Aptos" w:hAnsi="Aptos" w:eastAsia="Aptos"/>
-                      <w:b/>
-                      <w:i w:val="0"/>
-                      <w:color w:val="1F4E78"/>
-                      <w:sz w:val="19"/>
-                    </w:rPr>
-                    <w:t>1</w:t>
-                  </w:r>
-                </w:p>
-              </w:tc>
-              <w:tc>
-                <w:tcPr>
-                  <w:tcW w:type="dxa" w:w="539"/>
-                  <w:tcBorders>
-                    <w:top w:val="single" w:sz="7" w:space="0" w:color="9CA3AF"/>
-                    <w:left w:val="single" w:sz="7" w:space="0" w:color="9CA3AF"/>
-                    <w:bottom w:val="single" w:sz="7" w:space="0" w:color="9CA3AF"/>
-                    <w:right w:val="single" w:sz="7" w:space="0" w:color="9CA3AF"/>
-                    <w:insideH w:val="single" w:sz="7" w:space="0" w:color="9CA3AF"/>
-                    <w:insideV w:val="single" w:sz="7" w:space="0" w:color="9CA3AF"/>
-                  </w:tcBorders>
-                  <w:tcMar>
-                    <w:top w:w="40" w:type="dxa"/>
-                    <w:start w:w="40" w:type="dxa"/>
-                    <w:bottom w:w="40" w:type="dxa"/>
-                    <w:end w:w="40" w:type="dxa"/>
-                  </w:tcMar>
-                  <w:shd w:fill="FFFFFF"/>
-                </w:tcPr>
-                <w:p>
-                  <w:pPr>
-                    <w:keepNext w:val="0"/>
-                    <w:spacing w:before="0" w:after="0" w:line="240" w:lineRule="auto"/>
-                    <w:jc w:val="center"/>
-                  </w:pPr>
-                  <w:r>
-                    <w:rPr>
-                      <w:rFonts w:ascii="Aptos" w:hAnsi="Aptos" w:eastAsia="Aptos"/>
-                      <w:b/>
-                      <w:i w:val="0"/>
-                      <w:color w:val="1F4E78"/>
-                      <w:sz w:val="19"/>
-                    </w:rPr>
-                    <w:t>2</w:t>
-                  </w:r>
-                </w:p>
-              </w:tc>
-              <w:tc>
-                <w:tcPr>
-                  <w:tcW w:type="dxa" w:w="539"/>
-                  <w:tcBorders>
-                    <w:top w:val="single" w:sz="7" w:space="0" w:color="9CA3AF"/>
-                    <w:left w:val="single" w:sz="7" w:space="0" w:color="9CA3AF"/>
-                    <w:bottom w:val="single" w:sz="7" w:space="0" w:color="9CA3AF"/>
-                    <w:right w:val="single" w:sz="7" w:space="0" w:color="9CA3AF"/>
-                    <w:insideH w:val="single" w:sz="7" w:space="0" w:color="9CA3AF"/>
-                    <w:insideV w:val="single" w:sz="7" w:space="0" w:color="9CA3AF"/>
-                  </w:tcBorders>
-                  <w:tcMar>
-                    <w:top w:w="40" w:type="dxa"/>
-                    <w:start w:w="40" w:type="dxa"/>
-                    <w:bottom w:w="40" w:type="dxa"/>
-                    <w:end w:w="40" w:type="dxa"/>
-                  </w:tcMar>
-                  <w:shd w:fill="FFFFFF"/>
-                </w:tcPr>
-                <w:p>
-                  <w:pPr>
-                    <w:keepNext w:val="0"/>
-                    <w:spacing w:before="0" w:after="0" w:line="240" w:lineRule="auto"/>
-                    <w:jc w:val="center"/>
-                  </w:pPr>
-                  <w:r>
-                    <w:rPr>
-                      <w:rFonts w:ascii="Aptos" w:hAnsi="Aptos" w:eastAsia="Aptos"/>
-                      <w:b/>
-                      <w:i w:val="0"/>
-                      <w:color w:val="1F4E78"/>
-                      <w:sz w:val="19"/>
-                    </w:rPr>
-                    <w:t>3</w:t>
-                  </w:r>
-                </w:p>
-              </w:tc>
-              <w:tc>
-                <w:tcPr>
-                  <w:tcW w:type="dxa" w:w="539"/>
-                  <w:tcBorders>
-                    <w:top w:val="single" w:sz="7" w:space="0" w:color="9CA3AF"/>
-                    <w:left w:val="single" w:sz="7" w:space="0" w:color="9CA3AF"/>
-                    <w:bottom w:val="single" w:sz="7" w:space="0" w:color="9CA3AF"/>
-                    <w:right w:val="single" w:sz="7" w:space="0" w:color="9CA3AF"/>
-                    <w:insideH w:val="single" w:sz="7" w:space="0" w:color="9CA3AF"/>
-                    <w:insideV w:val="single" w:sz="7" w:space="0" w:color="9CA3AF"/>
-                  </w:tcBorders>
-                  <w:tcMar>
-                    <w:top w:w="40" w:type="dxa"/>
-                    <w:start w:w="40" w:type="dxa"/>
-                    <w:bottom w:w="40" w:type="dxa"/>
-                    <w:end w:w="40" w:type="dxa"/>
-                  </w:tcMar>
-                  <w:shd w:fill="FFFFFF"/>
-                </w:tcPr>
-                <w:p>
-                  <w:pPr>
-                    <w:keepNext w:val="0"/>
-                    <w:spacing w:before="0" w:after="0" w:line="240" w:lineRule="auto"/>
-                    <w:jc w:val="center"/>
-                  </w:pPr>
-                  <w:r>
-                    <w:rPr>
-                      <w:rFonts w:ascii="Aptos" w:hAnsi="Aptos" w:eastAsia="Aptos"/>
-                      <w:b/>
-                      <w:i w:val="0"/>
-                      <w:color w:val="1F4E78"/>
-                      <w:sz w:val="19"/>
-                    </w:rPr>
-                    <w:t>4</w:t>
-                  </w:r>
-                </w:p>
-              </w:tc>
-              <w:tc>
-                <w:tcPr>
-                  <w:tcW w:type="dxa" w:w="539"/>
-                  <w:tcBorders>
-                    <w:top w:val="single" w:sz="7" w:space="0" w:color="9CA3AF"/>
-                    <w:left w:val="single" w:sz="7" w:space="0" w:color="9CA3AF"/>
-                    <w:bottom w:val="single" w:sz="7" w:space="0" w:color="9CA3AF"/>
-                    <w:right w:val="single" w:sz="7" w:space="0" w:color="9CA3AF"/>
-                    <w:insideH w:val="single" w:sz="7" w:space="0" w:color="9CA3AF"/>
-                    <w:insideV w:val="single" w:sz="7" w:space="0" w:color="9CA3AF"/>
-                  </w:tcBorders>
-                  <w:tcMar>
-                    <w:top w:w="40" w:type="dxa"/>
-                    <w:start w:w="40" w:type="dxa"/>
-                    <w:bottom w:w="40" w:type="dxa"/>
-                    <w:end w:w="40" w:type="dxa"/>
-                  </w:tcMar>
-                  <w:shd w:fill="FFFFFF"/>
-                </w:tcPr>
-                <w:p>
-                  <w:pPr>
-                    <w:keepNext w:val="0"/>
-                    <w:spacing w:before="0" w:after="0" w:line="240" w:lineRule="auto"/>
-                    <w:jc w:val="center"/>
-                  </w:pPr>
-                  <w:r>
-                    <w:rPr>
-                      <w:rFonts w:ascii="Aptos" w:hAnsi="Aptos" w:eastAsia="Aptos"/>
-                      <w:b/>
-                      <w:i w:val="0"/>
-                      <w:color w:val="1F4E78"/>
-                      <w:sz w:val="19"/>
-                    </w:rPr>
-                    <w:t>5</w:t>
-                  </w:r>
-                </w:p>
-              </w:tc>
-              <w:tc>
-                <w:tcPr>
-                  <w:tcW w:type="dxa" w:w="539"/>
-                  <w:tcBorders>
-                    <w:top w:val="single" w:sz="7" w:space="0" w:color="9CA3AF"/>
-                    <w:left w:val="single" w:sz="7" w:space="0" w:color="9CA3AF"/>
-                    <w:bottom w:val="single" w:sz="7" w:space="0" w:color="9CA3AF"/>
-                    <w:right w:val="single" w:sz="7" w:space="0" w:color="9CA3AF"/>
-                    <w:insideH w:val="single" w:sz="7" w:space="0" w:color="9CA3AF"/>
-                    <w:insideV w:val="single" w:sz="7" w:space="0" w:color="9CA3AF"/>
-                  </w:tcBorders>
-                  <w:tcMar>
-                    <w:top w:w="40" w:type="dxa"/>
-                    <w:start w:w="40" w:type="dxa"/>
-                    <w:bottom w:w="40" w:type="dxa"/>
-                    <w:end w:w="40" w:type="dxa"/>
-                  </w:tcMar>
-                  <w:shd w:fill="FFFFFF"/>
-                </w:tcPr>
-                <w:p>
-                  <w:pPr>
-                    <w:keepNext w:val="0"/>
-                    <w:spacing w:before="0" w:after="0" w:line="240" w:lineRule="auto"/>
-                    <w:jc w:val="center"/>
-                  </w:pPr>
-                  <w:r>
-                    <w:rPr>
-                      <w:rFonts w:ascii="Aptos" w:hAnsi="Aptos" w:eastAsia="Aptos"/>
-                      <w:b/>
-                      <w:i w:val="0"/>
-                      <w:color w:val="1F4E78"/>
-                      <w:sz w:val="19"/>
-                    </w:rPr>
-                    <w:t>6</w:t>
-                  </w:r>
-                </w:p>
-              </w:tc>
-              <w:tc>
-                <w:tcPr>
-                  <w:tcW w:type="dxa" w:w="539"/>
-                  <w:tcBorders>
-                    <w:top w:val="single" w:sz="7" w:space="0" w:color="9CA3AF"/>
-                    <w:left w:val="single" w:sz="7" w:space="0" w:color="9CA3AF"/>
-                    <w:bottom w:val="single" w:sz="7" w:space="0" w:color="9CA3AF"/>
-                    <w:right w:val="single" w:sz="7" w:space="0" w:color="9CA3AF"/>
-                    <w:insideH w:val="single" w:sz="7" w:space="0" w:color="9CA3AF"/>
-                    <w:insideV w:val="single" w:sz="7" w:space="0" w:color="9CA3AF"/>
-                  </w:tcBorders>
-                  <w:tcMar>
-                    <w:top w:w="40" w:type="dxa"/>
-                    <w:start w:w="40" w:type="dxa"/>
-                    <w:bottom w:w="40" w:type="dxa"/>
-                    <w:end w:w="40" w:type="dxa"/>
-                  </w:tcMar>
-                  <w:shd w:fill="FFFFFF"/>
-                </w:tcPr>
-                <w:p>
-                  <w:pPr>
-                    <w:keepNext w:val="0"/>
-                    <w:spacing w:before="0" w:after="0" w:line="240" w:lineRule="auto"/>
-                    <w:jc w:val="center"/>
-                  </w:pPr>
-                  <w:r>
-                    <w:rPr>
-                      <w:rFonts w:ascii="Aptos" w:hAnsi="Aptos" w:eastAsia="Aptos"/>
-                      <w:b/>
-                      <w:i w:val="0"/>
-                      <w:color w:val="1F4E78"/>
-                      <w:sz w:val="19"/>
-                    </w:rPr>
-                    <w:t>7</w:t>
-                  </w:r>
-                </w:p>
-              </w:tc>
-              <w:tc>
-                <w:tcPr>
-                  <w:tcW w:type="dxa" w:w="539"/>
-                  <w:tcBorders>
-                    <w:top w:val="single" w:sz="7" w:space="0" w:color="9CA3AF"/>
-                    <w:left w:val="single" w:sz="7" w:space="0" w:color="9CA3AF"/>
-                    <w:bottom w:val="single" w:sz="7" w:space="0" w:color="9CA3AF"/>
-                    <w:right w:val="single" w:sz="7" w:space="0" w:color="9CA3AF"/>
-                    <w:insideH w:val="single" w:sz="7" w:space="0" w:color="9CA3AF"/>
-                    <w:insideV w:val="single" w:sz="7" w:space="0" w:color="9CA3AF"/>
-                  </w:tcBorders>
-                  <w:tcMar>
-                    <w:top w:w="40" w:type="dxa"/>
-                    <w:start w:w="40" w:type="dxa"/>
-                    <w:bottom w:w="40" w:type="dxa"/>
-                    <w:end w:w="40" w:type="dxa"/>
-                  </w:tcMar>
-                  <w:shd w:fill="FFFFFF"/>
-                </w:tcPr>
-                <w:p>
-                  <w:pPr>
-                    <w:keepNext w:val="0"/>
-                    <w:spacing w:before="0" w:after="0" w:line="240" w:lineRule="auto"/>
-                    <w:jc w:val="center"/>
-                  </w:pPr>
-                  <w:r>
-                    <w:rPr>
-                      <w:rFonts w:ascii="Aptos" w:hAnsi="Aptos" w:eastAsia="Aptos"/>
-                      <w:b/>
-                      <w:i w:val="0"/>
-                      <w:color w:val="1F4E78"/>
-                      <w:sz w:val="19"/>
-                    </w:rPr>
-                    <w:t>8</w:t>
-                  </w:r>
-                </w:p>
-              </w:tc>
-              <w:tc>
-                <w:tcPr>
-                  <w:tcW w:type="dxa" w:w="539"/>
-                  <w:tcBorders>
-                    <w:top w:val="single" w:sz="7" w:space="0" w:color="9CA3AF"/>
-                    <w:left w:val="single" w:sz="7" w:space="0" w:color="9CA3AF"/>
-                    <w:bottom w:val="single" w:sz="7" w:space="0" w:color="9CA3AF"/>
-                    <w:right w:val="single" w:sz="7" w:space="0" w:color="9CA3AF"/>
-                    <w:insideH w:val="single" w:sz="7" w:space="0" w:color="9CA3AF"/>
-                    <w:insideV w:val="single" w:sz="7" w:space="0" w:color="9CA3AF"/>
-                  </w:tcBorders>
-                  <w:tcMar>
-                    <w:top w:w="40" w:type="dxa"/>
-                    <w:start w:w="40" w:type="dxa"/>
-                    <w:bottom w:w="40" w:type="dxa"/>
-                    <w:end w:w="40" w:type="dxa"/>
-                  </w:tcMar>
-                  <w:shd w:fill="FFFFFF"/>
-                </w:tcPr>
-                <w:p>
-                  <w:pPr>
-                    <w:keepNext w:val="0"/>
-                    <w:spacing w:before="0" w:after="0" w:line="240" w:lineRule="auto"/>
-                    <w:jc w:val="center"/>
-                  </w:pPr>
-                  <w:r>
-                    <w:rPr>
-                      <w:rFonts w:ascii="Aptos" w:hAnsi="Aptos" w:eastAsia="Aptos"/>
-                      <w:b/>
-                      <w:i w:val="0"/>
-                      <w:color w:val="1F4E78"/>
-                      <w:sz w:val="19"/>
-                    </w:rPr>
-                    <w:t>9</w:t>
-                  </w:r>
-                </w:p>
-              </w:tc>
-              <w:tc>
-                <w:tcPr>
-                  <w:tcW w:type="dxa" w:w="539"/>
-                  <w:tcBorders>
-                    <w:top w:val="single" w:sz="7" w:space="0" w:color="9CA3AF"/>
-                    <w:left w:val="single" w:sz="7" w:space="0" w:color="9CA3AF"/>
-                    <w:bottom w:val="single" w:sz="7" w:space="0" w:color="9CA3AF"/>
-                    <w:right w:val="single" w:sz="7" w:space="0" w:color="9CA3AF"/>
-                    <w:insideH w:val="single" w:sz="7" w:space="0" w:color="9CA3AF"/>
-                    <w:insideV w:val="single" w:sz="7" w:space="0" w:color="9CA3AF"/>
-                  </w:tcBorders>
-                  <w:tcMar>
-                    <w:top w:w="40" w:type="dxa"/>
-                    <w:start w:w="40" w:type="dxa"/>
-                    <w:bottom w:w="40" w:type="dxa"/>
-                    <w:end w:w="40" w:type="dxa"/>
-                  </w:tcMar>
-                  <w:shd w:fill="FFFFFF"/>
-                </w:tcPr>
-                <w:p>
-                  <w:pPr>
-                    <w:keepNext w:val="0"/>
-                    <w:spacing w:before="0" w:after="0" w:line="240" w:lineRule="auto"/>
-                    <w:jc w:val="center"/>
-                  </w:pPr>
-                  <w:r>
-                    <w:rPr>
-                      <w:rFonts w:ascii="Aptos" w:hAnsi="Aptos" w:eastAsia="Aptos"/>
-                      <w:b/>
-                      <w:i w:val="0"/>
-                      <w:color w:val="1F4E78"/>
-                      <w:sz w:val="19"/>
-                    </w:rPr>
-                    <w:t>10</w:t>
-                  </w:r>
-                </w:p>
-              </w:tc>
-              <w:tc>
-                <w:tcPr>
-                  <w:tcW w:type="dxa" w:w="539"/>
-                  <w:tcBorders>
-                    <w:top w:val="single" w:sz="7" w:space="0" w:color="9CA3AF"/>
-                    <w:left w:val="single" w:sz="7" w:space="0" w:color="9CA3AF"/>
-                    <w:bottom w:val="single" w:sz="7" w:space="0" w:color="9CA3AF"/>
-                    <w:right w:val="single" w:sz="7" w:space="0" w:color="9CA3AF"/>
-                    <w:insideH w:val="single" w:sz="7" w:space="0" w:color="9CA3AF"/>
-                    <w:insideV w:val="single" w:sz="7" w:space="0" w:color="9CA3AF"/>
-                  </w:tcBorders>
-                  <w:tcMar>
-                    <w:top w:w="40" w:type="dxa"/>
-                    <w:start w:w="40" w:type="dxa"/>
-                    <w:bottom w:w="40" w:type="dxa"/>
-                    <w:end w:w="40" w:type="dxa"/>
-                  </w:tcMar>
-                  <w:shd w:fill="FFFFFF"/>
-                </w:tcPr>
-                <w:p>
-                  <w:pPr>
-                    <w:keepNext w:val="0"/>
-                    <w:spacing w:before="0" w:after="0" w:line="240" w:lineRule="auto"/>
-                    <w:jc w:val="center"/>
-                  </w:pPr>
-                  <w:r>
-                    <w:rPr>
-                      <w:rFonts w:ascii="Aptos" w:hAnsi="Aptos" w:eastAsia="Aptos"/>
-                      <w:b/>
-                      <w:i w:val="0"/>
-                      <w:color w:val="1F4E78"/>
-                      <w:sz w:val="19"/>
-                    </w:rPr>
-                    <w:t>11</w:t>
-                  </w:r>
-                </w:p>
-              </w:tc>
-              <w:tc>
-                <w:tcPr>
-                  <w:tcW w:type="dxa" w:w="539"/>
-                  <w:tcBorders>
-                    <w:top w:val="single" w:sz="7" w:space="0" w:color="9CA3AF"/>
-                    <w:left w:val="single" w:sz="7" w:space="0" w:color="9CA3AF"/>
-                    <w:bottom w:val="single" w:sz="7" w:space="0" w:color="9CA3AF"/>
-                    <w:right w:val="single" w:sz="7" w:space="0" w:color="9CA3AF"/>
-                    <w:insideH w:val="single" w:sz="7" w:space="0" w:color="9CA3AF"/>
-                    <w:insideV w:val="single" w:sz="7" w:space="0" w:color="9CA3AF"/>
-                  </w:tcBorders>
-                  <w:tcMar>
-                    <w:top w:w="40" w:type="dxa"/>
-                    <w:start w:w="40" w:type="dxa"/>
-                    <w:bottom w:w="40" w:type="dxa"/>
-                    <w:end w:w="40" w:type="dxa"/>
-                  </w:tcMar>
-                  <w:shd w:fill="FFFFFF"/>
-                </w:tcPr>
-                <w:p>
-                  <w:pPr>
-                    <w:keepNext w:val="0"/>
-                    <w:spacing w:before="0" w:after="0" w:line="240" w:lineRule="auto"/>
-                    <w:jc w:val="center"/>
-                  </w:pPr>
-                  <w:r>
-                    <w:rPr>
-                      <w:rFonts w:ascii="Aptos" w:hAnsi="Aptos" w:eastAsia="Aptos"/>
-                      <w:b/>
-                      <w:i w:val="0"/>
-                      <w:color w:val="1F4E78"/>
-                      <w:sz w:val="19"/>
-                    </w:rPr>
-                    <w:t>12</w:t>
-                  </w:r>
-                </w:p>
-              </w:tc>
-              <w:tc>
-                <w:tcPr>
-                  <w:tcW w:type="dxa" w:w="1077"/>
-                  <w:tcBorders>
-                    <w:top w:val="single" w:sz="7" w:space="0" w:color="9CA3AF"/>
-                    <w:left w:val="single" w:sz="7" w:space="0" w:color="9CA3AF"/>
-                    <w:bottom w:val="single" w:sz="7" w:space="0" w:color="9CA3AF"/>
-                    <w:right w:val="single" w:sz="7" w:space="0" w:color="9CA3AF"/>
-                    <w:insideH w:val="single" w:sz="7" w:space="0" w:color="9CA3AF"/>
-                    <w:insideV w:val="single" w:sz="7" w:space="0" w:color="9CA3AF"/>
-                  </w:tcBorders>
-                  <w:tcMar>
-                    <w:top w:w="40" w:type="dxa"/>
-                    <w:start w:w="40" w:type="dxa"/>
-                    <w:bottom w:w="40" w:type="dxa"/>
-                    <w:end w:w="40" w:type="dxa"/>
-                  </w:tcMar>
-                  <w:shd w:fill="EAF3F8"/>
-                </w:tcPr>
-                <w:p>
-                  <w:pPr>
-                    <w:keepNext w:val="0"/>
-                    <w:spacing w:before="0" w:after="0" w:line="240" w:lineRule="auto"/>
-                    <w:jc w:val="center"/>
-                  </w:pPr>
-                  <w:r>
-                    <w:rPr>
-                      <w:rFonts w:ascii="Aptos" w:hAnsi="Aptos" w:eastAsia="Aptos"/>
-                      <w:b w:val="0"/>
-                      <w:i w:val="0"/>
-                      <w:color w:val="1F2937"/>
-                      <w:sz w:val="19"/>
-                    </w:rPr>
-                    <w:t>razem</w:t>
-                  </w:r>
-                </w:p>
-              </w:tc>
-            </w:tr>
-            <w:tr>
-              <w:tc>
-                <w:tcPr>
-                  <w:tcW w:type="dxa" w:w="964"/>
-                  <w:tcBorders>
-                    <w:top w:val="single" w:sz="7" w:space="0" w:color="9CA3AF"/>
-                    <w:left w:val="single" w:sz="7" w:space="0" w:color="9CA3AF"/>
-                    <w:bottom w:val="single" w:sz="7" w:space="0" w:color="9CA3AF"/>
-                    <w:right w:val="single" w:sz="7" w:space="0" w:color="9CA3AF"/>
-                    <w:insideH w:val="single" w:sz="7" w:space="0" w:color="9CA3AF"/>
-                    <w:insideV w:val="single" w:sz="7" w:space="0" w:color="9CA3AF"/>
-                  </w:tcBorders>
-                  <w:tcMar>
-                    <w:top w:w="110" w:type="dxa"/>
-                    <w:start w:w="40" w:type="dxa"/>
-                    <w:bottom w:w="110" w:type="dxa"/>
-                    <w:end w:w="40" w:type="dxa"/>
-                  </w:tcMar>
-                  <w:shd w:fill="EAF3F8"/>
-                </w:tcPr>
-                <w:p>
-                  <w:pPr>
-                    <w:keepNext w:val="0"/>
-                    <w:spacing w:before="0" w:after="0" w:line="240" w:lineRule="auto"/>
-                    <w:jc w:val="center"/>
-                  </w:pPr>
-                  <w:r>
-                    <w:rPr>
-                      <w:rFonts w:ascii="Aptos" w:hAnsi="Aptos" w:eastAsia="Aptos"/>
-                      <w:b w:val="0"/>
-                      <w:i w:val="0"/>
-                      <w:color w:val="1F2937"/>
-                      <w:sz w:val="19"/>
-                    </w:rPr>
-                    <w:t>+</w:t>
-                  </w:r>
-                </w:p>
-              </w:tc>
-              <w:tc>
-                <w:tcPr>
-                  <w:tcW w:type="dxa" w:w="539"/>
-                  <w:tcBorders>
-                    <w:top w:val="single" w:sz="7" w:space="0" w:color="9CA3AF"/>
-                    <w:left w:val="single" w:sz="7" w:space="0" w:color="9CA3AF"/>
-                    <w:bottom w:val="single" w:sz="7" w:space="0" w:color="9CA3AF"/>
-                    <w:right w:val="single" w:sz="7" w:space="0" w:color="9CA3AF"/>
-                    <w:insideH w:val="single" w:sz="7" w:space="0" w:color="9CA3AF"/>
-                    <w:insideV w:val="single" w:sz="7" w:space="0" w:color="9CA3AF"/>
-                  </w:tcBorders>
-                  <w:tcMar>
-                    <w:top w:w="110" w:type="dxa"/>
-                    <w:start w:w="40" w:type="dxa"/>
-                    <w:bottom w:w="110" w:type="dxa"/>
-                    <w:end w:w="40" w:type="dxa"/>
-                  </w:tcMar>
-                  <w:shd w:fill="FFFFFF"/>
-                </w:tcPr>
-                <w:p>
-                  <w:pPr>
-                    <w:keepNext w:val="0"/>
-                    <w:spacing w:before="0" w:after="0" w:line="240" w:lineRule="auto"/>
-                    <w:jc w:val="center"/>
-                  </w:pPr>
-                  <w:r>
-                    <w:rPr>
-                      <w:rFonts w:ascii="Aptos" w:hAnsi="Aptos" w:eastAsia="Aptos"/>
-                      <w:b w:val="0"/>
-                      <w:i w:val="0"/>
-                      <w:color w:val="1F2937"/>
-                      <w:sz w:val="19"/>
-                    </w:rPr>
-                  </w:r>
-                </w:p>
-              </w:tc>
-              <w:tc>
-                <w:tcPr>
-                  <w:tcW w:type="dxa" w:w="539"/>
-                  <w:tcBorders>
-                    <w:top w:val="single" w:sz="7" w:space="0" w:color="9CA3AF"/>
-                    <w:left w:val="single" w:sz="7" w:space="0" w:color="9CA3AF"/>
-                    <w:bottom w:val="single" w:sz="7" w:space="0" w:color="9CA3AF"/>
-                    <w:right w:val="single" w:sz="7" w:space="0" w:color="9CA3AF"/>
-                    <w:insideH w:val="single" w:sz="7" w:space="0" w:color="9CA3AF"/>
-                    <w:insideV w:val="single" w:sz="7" w:space="0" w:color="9CA3AF"/>
-                  </w:tcBorders>
-                  <w:tcMar>
-                    <w:top w:w="110" w:type="dxa"/>
-                    <w:start w:w="40" w:type="dxa"/>
-                    <w:bottom w:w="110" w:type="dxa"/>
-                    <w:end w:w="40" w:type="dxa"/>
-                  </w:tcMar>
-                  <w:shd w:fill="FFFFFF"/>
-                </w:tcPr>
-                <w:p>
-                  <w:pPr>
-                    <w:keepNext w:val="0"/>
-                    <w:spacing w:before="0" w:after="0" w:line="240" w:lineRule="auto"/>
-                    <w:jc w:val="center"/>
-                  </w:pPr>
-                  <w:r>
-                    <w:rPr>
-                      <w:rFonts w:ascii="Aptos" w:hAnsi="Aptos" w:eastAsia="Aptos"/>
-                      <w:b w:val="0"/>
-                      <w:i w:val="0"/>
-                      <w:color w:val="1F2937"/>
-                      <w:sz w:val="19"/>
-                    </w:rPr>
-                  </w:r>
-                </w:p>
-              </w:tc>
-              <w:tc>
-                <w:tcPr>
-                  <w:tcW w:type="dxa" w:w="539"/>
-                  <w:tcBorders>
-                    <w:top w:val="single" w:sz="7" w:space="0" w:color="9CA3AF"/>
-                    <w:left w:val="single" w:sz="7" w:space="0" w:color="9CA3AF"/>
-                    <w:bottom w:val="single" w:sz="7" w:space="0" w:color="9CA3AF"/>
-                    <w:right w:val="single" w:sz="7" w:space="0" w:color="9CA3AF"/>
-                    <w:insideH w:val="single" w:sz="7" w:space="0" w:color="9CA3AF"/>
-                    <w:insideV w:val="single" w:sz="7" w:space="0" w:color="9CA3AF"/>
-                  </w:tcBorders>
-                  <w:tcMar>
-                    <w:top w:w="110" w:type="dxa"/>
-                    <w:start w:w="40" w:type="dxa"/>
-                    <w:bottom w:w="110" w:type="dxa"/>
-                    <w:end w:w="40" w:type="dxa"/>
-                  </w:tcMar>
-                  <w:shd w:fill="FFFFFF"/>
-                </w:tcPr>
-                <w:p>
-                  <w:pPr>
-                    <w:keepNext w:val="0"/>
-                    <w:spacing w:before="0" w:after="0" w:line="240" w:lineRule="auto"/>
-                    <w:jc w:val="center"/>
-                  </w:pPr>
-                  <w:r>
-                    <w:rPr>
-                      <w:rFonts w:ascii="Aptos" w:hAnsi="Aptos" w:eastAsia="Aptos"/>
-                      <w:b w:val="0"/>
-                      <w:i w:val="0"/>
-                      <w:color w:val="1F2937"/>
-                      <w:sz w:val="19"/>
-                    </w:rPr>
-                  </w:r>
-                </w:p>
-              </w:tc>
-              <w:tc>
-                <w:tcPr>
-                  <w:tcW w:type="dxa" w:w="539"/>
-                  <w:tcBorders>
-                    <w:top w:val="single" w:sz="7" w:space="0" w:color="9CA3AF"/>
-                    <w:left w:val="single" w:sz="7" w:space="0" w:color="9CA3AF"/>
-                    <w:bottom w:val="single" w:sz="7" w:space="0" w:color="9CA3AF"/>
-                    <w:right w:val="single" w:sz="7" w:space="0" w:color="9CA3AF"/>
-                    <w:insideH w:val="single" w:sz="7" w:space="0" w:color="9CA3AF"/>
-                    <w:insideV w:val="single" w:sz="7" w:space="0" w:color="9CA3AF"/>
-                  </w:tcBorders>
-                  <w:tcMar>
-                    <w:top w:w="110" w:type="dxa"/>
-                    <w:start w:w="40" w:type="dxa"/>
-                    <w:bottom w:w="110" w:type="dxa"/>
-                    <w:end w:w="40" w:type="dxa"/>
-                  </w:tcMar>
-                  <w:shd w:fill="FFFFFF"/>
-                </w:tcPr>
-                <w:p>
-                  <w:pPr>
-                    <w:keepNext w:val="0"/>
-                    <w:spacing w:before="0" w:after="0" w:line="240" w:lineRule="auto"/>
-                    <w:jc w:val="center"/>
-                  </w:pPr>
-                  <w:r>
-                    <w:rPr>
-                      <w:rFonts w:ascii="Aptos" w:hAnsi="Aptos" w:eastAsia="Aptos"/>
-                      <w:b w:val="0"/>
-                      <w:i w:val="0"/>
-                      <w:color w:val="1F2937"/>
-                      <w:sz w:val="19"/>
-                    </w:rPr>
-                  </w:r>
-                </w:p>
-              </w:tc>
-              <w:tc>
-                <w:tcPr>
-                  <w:tcW w:type="dxa" w:w="539"/>
-                  <w:tcBorders>
-                    <w:top w:val="single" w:sz="7" w:space="0" w:color="9CA3AF"/>
-                    <w:left w:val="single" w:sz="7" w:space="0" w:color="9CA3AF"/>
-                    <w:bottom w:val="single" w:sz="7" w:space="0" w:color="9CA3AF"/>
-                    <w:right w:val="single" w:sz="7" w:space="0" w:color="9CA3AF"/>
-                    <w:insideH w:val="single" w:sz="7" w:space="0" w:color="9CA3AF"/>
-                    <w:insideV w:val="single" w:sz="7" w:space="0" w:color="9CA3AF"/>
-                  </w:tcBorders>
-                  <w:tcMar>
-                    <w:top w:w="110" w:type="dxa"/>
-                    <w:start w:w="40" w:type="dxa"/>
-                    <w:bottom w:w="110" w:type="dxa"/>
-                    <w:end w:w="40" w:type="dxa"/>
-                  </w:tcMar>
-                  <w:shd w:fill="FFFFFF"/>
-                </w:tcPr>
-                <w:p>
-                  <w:pPr>
-                    <w:keepNext w:val="0"/>
-                    <w:spacing w:before="0" w:after="0" w:line="240" w:lineRule="auto"/>
-                    <w:jc w:val="center"/>
-                  </w:pPr>
-                  <w:r>
-                    <w:rPr>
-                      <w:rFonts w:ascii="Aptos" w:hAnsi="Aptos" w:eastAsia="Aptos"/>
-                      <w:b w:val="0"/>
-                      <w:i w:val="0"/>
-                      <w:color w:val="1F2937"/>
-                      <w:sz w:val="19"/>
-                    </w:rPr>
-                  </w:r>
-                </w:p>
-              </w:tc>
-              <w:tc>
-                <w:tcPr>
-                  <w:tcW w:type="dxa" w:w="539"/>
-                  <w:tcBorders>
-                    <w:top w:val="single" w:sz="7" w:space="0" w:color="9CA3AF"/>
-                    <w:left w:val="single" w:sz="7" w:space="0" w:color="9CA3AF"/>
-                    <w:bottom w:val="single" w:sz="7" w:space="0" w:color="9CA3AF"/>
-                    <w:right w:val="single" w:sz="7" w:space="0" w:color="9CA3AF"/>
-                    <w:insideH w:val="single" w:sz="7" w:space="0" w:color="9CA3AF"/>
-                    <w:insideV w:val="single" w:sz="7" w:space="0" w:color="9CA3AF"/>
-                  </w:tcBorders>
-                  <w:tcMar>
-                    <w:top w:w="110" w:type="dxa"/>
-                    <w:start w:w="40" w:type="dxa"/>
-                    <w:bottom w:w="110" w:type="dxa"/>
-                    <w:end w:w="40" w:type="dxa"/>
-                  </w:tcMar>
-                  <w:shd w:fill="FFFFFF"/>
-                </w:tcPr>
-                <w:p>
-                  <w:pPr>
-                    <w:keepNext w:val="0"/>
-                    <w:spacing w:before="0" w:after="0" w:line="240" w:lineRule="auto"/>
-                    <w:jc w:val="center"/>
-                  </w:pPr>
-                  <w:r>
-                    <w:rPr>
-                      <w:rFonts w:ascii="Aptos" w:hAnsi="Aptos" w:eastAsia="Aptos"/>
-                      <w:b w:val="0"/>
-                      <w:i w:val="0"/>
-                      <w:color w:val="1F2937"/>
-                      <w:sz w:val="19"/>
-                    </w:rPr>
-                  </w:r>
-                </w:p>
-              </w:tc>
-              <w:tc>
-                <w:tcPr>
-                  <w:tcW w:type="dxa" w:w="539"/>
-                  <w:tcBorders>
-                    <w:top w:val="single" w:sz="7" w:space="0" w:color="9CA3AF"/>
-                    <w:left w:val="single" w:sz="7" w:space="0" w:color="9CA3AF"/>
-                    <w:bottom w:val="single" w:sz="7" w:space="0" w:color="9CA3AF"/>
-                    <w:right w:val="single" w:sz="7" w:space="0" w:color="9CA3AF"/>
-                    <w:insideH w:val="single" w:sz="7" w:space="0" w:color="9CA3AF"/>
-                    <w:insideV w:val="single" w:sz="7" w:space="0" w:color="9CA3AF"/>
-                  </w:tcBorders>
-                  <w:tcMar>
-                    <w:top w:w="110" w:type="dxa"/>
-                    <w:start w:w="40" w:type="dxa"/>
-                    <w:bottom w:w="110" w:type="dxa"/>
-                    <w:end w:w="40" w:type="dxa"/>
-                  </w:tcMar>
-                  <w:shd w:fill="FFFFFF"/>
-                </w:tcPr>
-                <w:p>
-                  <w:pPr>
-                    <w:keepNext w:val="0"/>
-                    <w:spacing w:before="0" w:after="0" w:line="240" w:lineRule="auto"/>
-                    <w:jc w:val="center"/>
-                  </w:pPr>
-                  <w:r>
-                    <w:rPr>
-                      <w:rFonts w:ascii="Aptos" w:hAnsi="Aptos" w:eastAsia="Aptos"/>
-                      <w:b w:val="0"/>
-                      <w:i w:val="0"/>
-                      <w:color w:val="1F2937"/>
-                      <w:sz w:val="19"/>
-                    </w:rPr>
-                  </w:r>
-                </w:p>
-              </w:tc>
-              <w:tc>
-                <w:tcPr>
-                  <w:tcW w:type="dxa" w:w="539"/>
-                  <w:tcBorders>
-                    <w:top w:val="single" w:sz="7" w:space="0" w:color="9CA3AF"/>
-                    <w:left w:val="single" w:sz="7" w:space="0" w:color="9CA3AF"/>
-                    <w:bottom w:val="single" w:sz="7" w:space="0" w:color="9CA3AF"/>
-                    <w:right w:val="single" w:sz="7" w:space="0" w:color="9CA3AF"/>
-                    <w:insideH w:val="single" w:sz="7" w:space="0" w:color="9CA3AF"/>
-                    <w:insideV w:val="single" w:sz="7" w:space="0" w:color="9CA3AF"/>
-                  </w:tcBorders>
-                  <w:tcMar>
-                    <w:top w:w="110" w:type="dxa"/>
-                    <w:start w:w="40" w:type="dxa"/>
-                    <w:bottom w:w="110" w:type="dxa"/>
-                    <w:end w:w="40" w:type="dxa"/>
-                  </w:tcMar>
-                  <w:shd w:fill="FFFFFF"/>
-                </w:tcPr>
-                <w:p>
-                  <w:pPr>
-                    <w:keepNext w:val="0"/>
-                    <w:spacing w:before="0" w:after="0" w:line="240" w:lineRule="auto"/>
-                    <w:jc w:val="center"/>
-                  </w:pPr>
-                  <w:r>
-                    <w:rPr>
-                      <w:rFonts w:ascii="Aptos" w:hAnsi="Aptos" w:eastAsia="Aptos"/>
-                      <w:b w:val="0"/>
-                      <w:i w:val="0"/>
-                      <w:color w:val="1F2937"/>
-                      <w:sz w:val="19"/>
-                    </w:rPr>
-                  </w:r>
-                </w:p>
-              </w:tc>
-              <w:tc>
-                <w:tcPr>
-                  <w:tcW w:type="dxa" w:w="539"/>
-                  <w:tcBorders>
-                    <w:top w:val="single" w:sz="7" w:space="0" w:color="9CA3AF"/>
-                    <w:left w:val="single" w:sz="7" w:space="0" w:color="9CA3AF"/>
-                    <w:bottom w:val="single" w:sz="7" w:space="0" w:color="9CA3AF"/>
-                    <w:right w:val="single" w:sz="7" w:space="0" w:color="9CA3AF"/>
-                    <w:insideH w:val="single" w:sz="7" w:space="0" w:color="9CA3AF"/>
-                    <w:insideV w:val="single" w:sz="7" w:space="0" w:color="9CA3AF"/>
-                  </w:tcBorders>
-                  <w:tcMar>
-                    <w:top w:w="110" w:type="dxa"/>
-                    <w:start w:w="40" w:type="dxa"/>
-                    <w:bottom w:w="110" w:type="dxa"/>
-                    <w:end w:w="40" w:type="dxa"/>
-                  </w:tcMar>
-                  <w:shd w:fill="FFFFFF"/>
-                </w:tcPr>
-                <w:p>
-                  <w:pPr>
-                    <w:keepNext w:val="0"/>
-                    <w:spacing w:before="0" w:after="0" w:line="240" w:lineRule="auto"/>
-                    <w:jc w:val="center"/>
-                  </w:pPr>
-                  <w:r>
-                    <w:rPr>
-                      <w:rFonts w:ascii="Aptos" w:hAnsi="Aptos" w:eastAsia="Aptos"/>
-                      <w:b w:val="0"/>
-                      <w:i w:val="0"/>
-                      <w:color w:val="1F2937"/>
-                      <w:sz w:val="19"/>
-                    </w:rPr>
-                  </w:r>
-                </w:p>
-              </w:tc>
-              <w:tc>
-                <w:tcPr>
-                  <w:tcW w:type="dxa" w:w="539"/>
-                  <w:tcBorders>
-                    <w:top w:val="single" w:sz="7" w:space="0" w:color="9CA3AF"/>
-                    <w:left w:val="single" w:sz="7" w:space="0" w:color="9CA3AF"/>
-                    <w:bottom w:val="single" w:sz="7" w:space="0" w:color="9CA3AF"/>
-                    <w:right w:val="single" w:sz="7" w:space="0" w:color="9CA3AF"/>
-                    <w:insideH w:val="single" w:sz="7" w:space="0" w:color="9CA3AF"/>
-                    <w:insideV w:val="single" w:sz="7" w:space="0" w:color="9CA3AF"/>
-                  </w:tcBorders>
-                  <w:tcMar>
-                    <w:top w:w="110" w:type="dxa"/>
-                    <w:start w:w="40" w:type="dxa"/>
-                    <w:bottom w:w="110" w:type="dxa"/>
-                    <w:end w:w="40" w:type="dxa"/>
-                  </w:tcMar>
-                  <w:shd w:fill="FFFFFF"/>
-                </w:tcPr>
-                <w:p>
-                  <w:pPr>
-                    <w:keepNext w:val="0"/>
-                    <w:spacing w:before="0" w:after="0" w:line="240" w:lineRule="auto"/>
-                    <w:jc w:val="center"/>
-                  </w:pPr>
-                  <w:r>
-                    <w:rPr>
-                      <w:rFonts w:ascii="Aptos" w:hAnsi="Aptos" w:eastAsia="Aptos"/>
-                      <w:b w:val="0"/>
-                      <w:i w:val="0"/>
-                      <w:color w:val="1F2937"/>
-                      <w:sz w:val="19"/>
-                    </w:rPr>
-                  </w:r>
-                </w:p>
-              </w:tc>
-              <w:tc>
-                <w:tcPr>
-                  <w:tcW w:type="dxa" w:w="539"/>
-                  <w:tcBorders>
-                    <w:top w:val="single" w:sz="7" w:space="0" w:color="9CA3AF"/>
-                    <w:left w:val="single" w:sz="7" w:space="0" w:color="9CA3AF"/>
-                    <w:bottom w:val="single" w:sz="7" w:space="0" w:color="9CA3AF"/>
-                    <w:right w:val="single" w:sz="7" w:space="0" w:color="9CA3AF"/>
-                    <w:insideH w:val="single" w:sz="7" w:space="0" w:color="9CA3AF"/>
-                    <w:insideV w:val="single" w:sz="7" w:space="0" w:color="9CA3AF"/>
-                  </w:tcBorders>
-                  <w:tcMar>
-                    <w:top w:w="110" w:type="dxa"/>
-                    <w:start w:w="40" w:type="dxa"/>
-                    <w:bottom w:w="110" w:type="dxa"/>
-                    <w:end w:w="40" w:type="dxa"/>
-                  </w:tcMar>
-                  <w:shd w:fill="FFFFFF"/>
-                </w:tcPr>
-                <w:p>
-                  <w:pPr>
-                    <w:keepNext w:val="0"/>
-                    <w:spacing w:before="0" w:after="0" w:line="240" w:lineRule="auto"/>
-                    <w:jc w:val="center"/>
-                  </w:pPr>
-                  <w:r>
-                    <w:rPr>
-                      <w:rFonts w:ascii="Aptos" w:hAnsi="Aptos" w:eastAsia="Aptos"/>
-                      <w:b w:val="0"/>
-                      <w:i w:val="0"/>
-                      <w:color w:val="1F2937"/>
-                      <w:sz w:val="19"/>
-                    </w:rPr>
-                  </w:r>
-                </w:p>
-              </w:tc>
-              <w:tc>
-                <w:tcPr>
-                  <w:tcW w:type="dxa" w:w="539"/>
-                  <w:tcBorders>
-                    <w:top w:val="single" w:sz="7" w:space="0" w:color="9CA3AF"/>
-                    <w:left w:val="single" w:sz="7" w:space="0" w:color="9CA3AF"/>
-                    <w:bottom w:val="single" w:sz="7" w:space="0" w:color="9CA3AF"/>
-                    <w:right w:val="single" w:sz="7" w:space="0" w:color="9CA3AF"/>
-                    <w:insideH w:val="single" w:sz="7" w:space="0" w:color="9CA3AF"/>
-                    <w:insideV w:val="single" w:sz="7" w:space="0" w:color="9CA3AF"/>
-                  </w:tcBorders>
-                  <w:tcMar>
-                    <w:top w:w="110" w:type="dxa"/>
-                    <w:start w:w="40" w:type="dxa"/>
-                    <w:bottom w:w="110" w:type="dxa"/>
-                    <w:end w:w="40" w:type="dxa"/>
-                  </w:tcMar>
-                  <w:shd w:fill="FFFFFF"/>
-                </w:tcPr>
-                <w:p>
-                  <w:pPr>
-                    <w:keepNext w:val="0"/>
-                    <w:spacing w:before="0" w:after="0" w:line="240" w:lineRule="auto"/>
-                    <w:jc w:val="center"/>
-                  </w:pPr>
-                  <w:r>
-                    <w:rPr>
-                      <w:rFonts w:ascii="Aptos" w:hAnsi="Aptos" w:eastAsia="Aptos"/>
-                      <w:b w:val="0"/>
-                      <w:i w:val="0"/>
-                      <w:color w:val="1F2937"/>
-                      <w:sz w:val="19"/>
-                    </w:rPr>
-                  </w:r>
-                </w:p>
-              </w:tc>
-              <w:tc>
-                <w:tcPr>
-                  <w:tcW w:type="dxa" w:w="1077"/>
-                  <w:tcBorders>
-                    <w:top w:val="single" w:sz="7" w:space="0" w:color="9CA3AF"/>
-                    <w:left w:val="single" w:sz="7" w:space="0" w:color="9CA3AF"/>
-                    <w:bottom w:val="single" w:sz="7" w:space="0" w:color="9CA3AF"/>
-                    <w:right w:val="single" w:sz="7" w:space="0" w:color="9CA3AF"/>
-                    <w:insideH w:val="single" w:sz="7" w:space="0" w:color="9CA3AF"/>
-                    <w:insideV w:val="single" w:sz="7" w:space="0" w:color="9CA3AF"/>
-                  </w:tcBorders>
-                  <w:tcMar>
-                    <w:top w:w="110" w:type="dxa"/>
-                    <w:start w:w="40" w:type="dxa"/>
-                    <w:bottom w:w="110" w:type="dxa"/>
-                    <w:end w:w="40" w:type="dxa"/>
-                  </w:tcMar>
-                  <w:shd w:fill="FFFFFF"/>
-                </w:tcPr>
-                <w:p>
-                  <w:pPr>
-                    <w:keepNext w:val="0"/>
-                    <w:spacing w:before="0" w:after="0" w:line="240" w:lineRule="auto"/>
-                    <w:jc w:val="center"/>
-                  </w:pPr>
-                  <w:r>
-                    <w:rPr>
-                      <w:rFonts w:ascii="Aptos" w:hAnsi="Aptos" w:eastAsia="Aptos"/>
-                      <w:b/>
-                      <w:i w:val="0"/>
-                      <w:color w:val="1F2937"/>
-                      <w:sz w:val="19"/>
-                    </w:rPr>
-                    <w:t xml:space="preserve">    / 12</w:t>
-                  </w:r>
-                </w:p>
-              </w:tc>
-            </w:tr>
-          </w:tbl>
-          <w:p/>
           <w:p>
             <w:pPr>
               <w:keepNext w:val="0"/>
-              <w:spacing w:before="80" w:after="80" w:line="252" w:lineRule="auto"/>
+              <w:spacing w:before="40" w:after="100" w:line="252" w:lineRule="auto"/>
             </w:pPr>
             <w:r>
               <w:rPr>
@@ -2234,7 +1350,37 @@
                 <w:color w:val="1F2937"/>
                 <w:sz w:val="19"/>
               </w:rPr>
-              <w:t xml:space="preserve">4-8 zadań = </w:t>
+              <w:t xml:space="preserve">Moje plusy: </w:t>
+            </w:r>
+            <w:r>
+              <w:rPr>
+                <w:rFonts w:ascii="Aptos" w:hAnsi="Aptos" w:eastAsia="Aptos"/>
+                <w:b w:val="0"/>
+                <w:i w:val="0"/>
+                <w:color w:val="9CA3AF"/>
+                <w:sz w:val="19"/>
+              </w:rPr>
+              <w:t>..............</w:t>
+            </w:r>
+            <w:r>
+              <w:rPr>
+                <w:rFonts w:ascii="Aptos" w:hAnsi="Aptos" w:eastAsia="Aptos"/>
+                <w:b w:val="0"/>
+                <w:i w:val="0"/>
+                <w:color w:val="1F2937"/>
+                <w:sz w:val="19"/>
+              </w:rPr>
+              <w:t xml:space="preserve"> / 12          </w:t>
+            </w:r>
+            <w:r>
+              <w:rPr>
+                <w:rFonts w:ascii="Aptos" w:hAnsi="Aptos" w:eastAsia="Aptos"/>
+                <w:b w:val="0"/>
+                <w:i w:val="0"/>
+                <w:color w:val="1F2937"/>
+                <w:sz w:val="19"/>
+              </w:rPr>
+              <w:t xml:space="preserve">4-8 = </w:t>
             </w:r>
             <w:r>
               <w:rPr>
@@ -2254,7 +1400,7 @@
                 <w:color w:val="1F2937"/>
                 <w:sz w:val="19"/>
               </w:rPr>
-              <w:t xml:space="preserve">     9-10 zadań = </w:t>
+              <w:t xml:space="preserve">     9-10 = </w:t>
             </w:r>
             <w:r>
               <w:rPr>
@@ -2274,7 +1420,7 @@
                 <w:color w:val="1F2937"/>
                 <w:sz w:val="19"/>
               </w:rPr>
-              <w:t xml:space="preserve">     11-12 zadań = </w:t>
+              <w:t xml:space="preserve">     11-12 = </w:t>
             </w:r>
             <w:r>
               <w:rPr>
@@ -2285,26 +1431,6 @@
                 <w:sz w:val="19"/>
               </w:rPr>
               <w:t>+++</w:t>
-            </w:r>
-            <w:r>
-              <w:rPr>
-                <w:rFonts w:ascii="Aptos" w:hAnsi="Aptos" w:eastAsia="Aptos"/>
-                <w:b w:val="0"/>
-                <w:i w:val="0"/>
-                <w:color w:val="1F2937"/>
-                <w:sz w:val="19"/>
-              </w:rPr>
-              <w:t xml:space="preserve">          Moje plusy: </w:t>
-            </w:r>
-            <w:r>
-              <w:rPr>
-                <w:rFonts w:ascii="Aptos" w:hAnsi="Aptos" w:eastAsia="Aptos"/>
-                <w:b w:val="0"/>
-                <w:i w:val="0"/>
-                <w:color w:val="9CA3AF"/>
-                <w:sz w:val="19"/>
-              </w:rPr>
-              <w:t>..............</w:t>
             </w:r>
           </w:p>
           <w:p>

</xml_diff>